<commit_message>
Deja el informe de Parque Arauco solo con visitas que tuvieron un defecto.
Se excluyen instalaciones, reubicaciones, validaciones y revisiones sin falla.

Co-authored-by: anibaloperacionesWes <anibaloperacionesWes@users.noreply.github.com>
</commit_message>
<xml_diff>
--- a/reports/Parque_Arauco/Visitas_2026/Visitas_Parque_Arauco_2026.docx
+++ b/reports/Parque_Arauco/Visitas_2026/Visitas_Parque_Arauco_2026.docx
@@ -27,7 +27,7 @@
           <w:color w:val="1F4E79"/>
           <w:sz w:val="40"/>
         </w:rPr>
-        <w:t>Visitas realizadas a Parque Arauco</w:t>
+        <w:t>Visitas con defecto — Parque Arauco</w:t>
       </w:r>
     </w:p>
     <w:p>
@@ -41,7 +41,7 @@
           <w:color w:val="4A8CB8"/>
           <w:sz w:val="24"/>
         </w:rPr>
-        <w:t>Todo 2026  ·  1 de enero al 6 de octubre</w:t>
+        <w:t>2026  ·  1 de enero al 6 de octubre  ·  sin instalaciones</w:t>
       </w:r>
     </w:p>
     <w:p>
@@ -54,7 +54,7 @@
           <w:b w:val="0"/>
           <w:sz w:val="22"/>
         </w:rPr>
-        <w:t>En lo que va de 2026 se registraron 41 visitas a los malls de Parque Arauco (50 intervenciones o actas). Una visita corresponde a un mall en un día, aunque ese día se haya intervenido más de un punto.</w:t>
+        <w:t>Quedan 20 visitas en las que se encontró un defecto (24 puntos o trabajos). Una visita es un mall en un día. Se dejaron fuera las instalaciones, reubicaciones, puestas en marcha, lecturas de validación y las revisiones en las que el equipo no tenía falla.</w:t>
       </w:r>
     </w:p>
     <w:p>
@@ -68,7 +68,7 @@
           <w:color w:val="555555"/>
           <w:sz w:val="20"/>
         </w:rPr>
-        <w:t>Fuentes: carpeta Drive «Actas de Mantencion / PARQUE ARAUCO» (respaldos por mall), actas digitales con folio y hoja Datos del Registro de fallas WES. El corte es el 6 de octubre de 2026.</w:t>
+        <w:t>La clasificación sale del Registro de fallas WES y de la observación escrita en cada acta.</w:t>
       </w:r>
     </w:p>
     <w:p>
@@ -148,7 +148,7 @@
                 <w:color w:val="FFFFFF"/>
                 <w:sz w:val="20"/>
               </w:rPr>
-              <w:t>Intervenciones</w:t>
+              <w:t>Puntos con defecto</w:t>
             </w:r>
           </w:p>
         </w:tc>
@@ -166,7 +166,7 @@
                 <w:color w:val="FFFFFF"/>
                 <w:sz w:val="20"/>
               </w:rPr>
-              <w:t>Última visita</w:t>
+              <w:t>Última</w:t>
             </w:r>
           </w:p>
         </w:tc>
@@ -200,7 +200,7 @@
                 <w:b w:val="0"/>
                 <w:sz w:val="20"/>
               </w:rPr>
-              <w:t>6</w:t>
+              <w:t>1</w:t>
             </w:r>
           </w:p>
         </w:tc>
@@ -216,7 +216,7 @@
                 <w:b w:val="0"/>
                 <w:sz w:val="20"/>
               </w:rPr>
-              <w:t>6</w:t>
+              <w:t>1</w:t>
             </w:r>
           </w:p>
         </w:tc>
@@ -232,7 +232,7 @@
                 <w:b w:val="0"/>
                 <w:sz w:val="20"/>
               </w:rPr>
-              <w:t>18-05-2026</w:t>
+              <w:t>12-03-2026</w:t>
             </w:r>
           </w:p>
         </w:tc>
@@ -266,7 +266,7 @@
                 <w:b w:val="0"/>
                 <w:sz w:val="20"/>
               </w:rPr>
-              <w:t>3</w:t>
+              <w:t>4</w:t>
             </w:r>
           </w:p>
         </w:tc>
@@ -282,7 +282,7 @@
                 <w:b w:val="0"/>
                 <w:sz w:val="20"/>
               </w:rPr>
-              <w:t>3</w:t>
+              <w:t>4</w:t>
             </w:r>
           </w:p>
         </w:tc>
@@ -332,7 +332,7 @@
                 <w:b w:val="0"/>
                 <w:sz w:val="20"/>
               </w:rPr>
-              <w:t>4</w:t>
+              <w:t>3</w:t>
             </w:r>
           </w:p>
         </w:tc>
@@ -398,7 +398,7 @@
                 <w:b w:val="0"/>
                 <w:sz w:val="20"/>
               </w:rPr>
-              <w:t>15</w:t>
+              <w:t>9</w:t>
             </w:r>
           </w:p>
         </w:tc>
@@ -414,7 +414,7 @@
                 <w:b w:val="0"/>
                 <w:sz w:val="20"/>
               </w:rPr>
-              <w:t>22</w:t>
+              <w:t>12</w:t>
             </w:r>
           </w:p>
         </w:tc>
@@ -430,7 +430,7 @@
                 <w:b w:val="0"/>
                 <w:sz w:val="20"/>
               </w:rPr>
-              <w:t>01-10-2026</w:t>
+              <w:t>27-09-2026</w:t>
             </w:r>
           </w:p>
         </w:tc>
@@ -464,7 +464,7 @@
                 <w:b w:val="0"/>
                 <w:sz w:val="20"/>
               </w:rPr>
-              <w:t>7</w:t>
+              <w:t>1</w:t>
             </w:r>
           </w:p>
         </w:tc>
@@ -480,7 +480,7 @@
                 <w:b w:val="0"/>
                 <w:sz w:val="20"/>
               </w:rPr>
-              <w:t>7</w:t>
+              <w:t>1</w:t>
             </w:r>
           </w:p>
         </w:tc>
@@ -496,7 +496,7 @@
                 <w:b w:val="0"/>
                 <w:sz w:val="20"/>
               </w:rPr>
-              <w:t>11-08-2026</w:t>
+              <w:t>02-04-2026</w:t>
             </w:r>
           </w:p>
         </w:tc>
@@ -530,7 +530,7 @@
                 <w:b w:val="0"/>
                 <w:sz w:val="20"/>
               </w:rPr>
-              <w:t>3</w:t>
+              <w:t>0</w:t>
             </w:r>
           </w:p>
         </w:tc>
@@ -546,7 +546,7 @@
                 <w:b w:val="0"/>
                 <w:sz w:val="20"/>
               </w:rPr>
-              <w:t>3</w:t>
+              <w:t>0</w:t>
             </w:r>
           </w:p>
         </w:tc>
@@ -562,7 +562,7 @@
                 <w:b w:val="0"/>
                 <w:sz w:val="20"/>
               </w:rPr>
-              <w:t>15-07-2026</w:t>
+              <w:t>—</w:t>
             </w:r>
           </w:p>
         </w:tc>
@@ -596,7 +596,7 @@
                 <w:b w:val="0"/>
                 <w:sz w:val="20"/>
               </w:rPr>
-              <w:t>3</w:t>
+              <w:t>2</w:t>
             </w:r>
           </w:p>
         </w:tc>
@@ -612,7 +612,7 @@
                 <w:b w:val="0"/>
                 <w:sz w:val="20"/>
               </w:rPr>
-              <w:t>5</w:t>
+              <w:t>2</w:t>
             </w:r>
           </w:p>
         </w:tc>
@@ -664,7 +664,7 @@
                 <w:b/>
                 <w:sz w:val="20"/>
               </w:rPr>
-              <w:t>41</w:t>
+              <w:t>20</w:t>
             </w:r>
           </w:p>
         </w:tc>
@@ -681,7 +681,7 @@
                 <w:b/>
                 <w:sz w:val="20"/>
               </w:rPr>
-              <w:t>50</w:t>
+              <w:t>24</w:t>
             </w:r>
           </w:p>
         </w:tc>
@@ -765,7 +765,7 @@
           <w:color w:val="1F4E79"/>
           <w:sz w:val="28"/>
         </w:rPr>
-        <w:t>Detalle cronológico</w:t>
+        <w:t>Detalle</w:t>
       </w:r>
     </w:p>
     <w:p>
@@ -807,7 +807,7 @@
           <w:color w:val="444444"/>
           <w:sz w:val="20"/>
         </w:rPr>
-        <w:t>Técnico: No indicado en el registro. Acta archivada en la carpeta Arauco Quilicura.</w:t>
+        <w:t>Técnico: No identificado en el acta.</w:t>
       </w:r>
     </w:p>
     <w:p>
@@ -820,12 +820,12 @@
           <w:b/>
           <w:sz w:val="22"/>
         </w:rPr>
-        <w:t>Acta de visita — Acta en Drive</w:t>
+        <w:t>MAX 232</w:t>
       </w:r>
     </w:p>
     <w:p>
       <w:pPr>
-        <w:spacing w:after="20" w:before="0"/>
+        <w:spacing w:after="60" w:before="0"/>
       </w:pPr>
       <w:r>
         <w:rPr>
@@ -833,12 +833,12 @@
           <w:b w:val="0"/>
           <w:sz w:val="22"/>
         </w:rPr>
-        <w:t>Respaldo fotográfico / acta en Drive (sin fila en el Registro de fallas).</w:t>
+        <w:t>Cambio de MAX 232. Se normaliza el voltaje de la fuente.</w:t>
       </w:r>
     </w:p>
     <w:p>
       <w:pPr>
-        <w:spacing w:after="80" w:before="0"/>
+        <w:spacing w:after="120" w:before="0"/>
       </w:pPr>
       <w:r>
         <w:rPr>
@@ -847,7 +847,7 @@
           <w:color w:val="555555"/>
           <w:sz w:val="18"/>
         </w:rPr>
-        <w:t>Respaldo: BOM 05-01-2026</w:t>
+        <w:t>El PDF está en la carpeta de Quilicura y el nombre del archivo es BOM.</w:t>
       </w:r>
     </w:p>
     <w:p>
@@ -888,12 +888,12 @@
           <w:b/>
           <w:sz w:val="22"/>
         </w:rPr>
-        <w:t>ESTANQUE CARGA ESTANQUE SUR — Mtto Correctivo — Comunicación — Router</w:t>
+        <w:t>Estanque sur</w:t>
       </w:r>
     </w:p>
     <w:p>
       <w:pPr>
-        <w:spacing w:after="20" w:before="0"/>
+        <w:spacing w:after="60" w:before="0"/>
       </w:pPr>
       <w:r>
         <w:rPr>
@@ -901,307 +901,7 @@
           <w:b w:val="0"/>
           <w:sz w:val="22"/>
         </w:rPr>
-        <w:t>router con problemas de conexion, este es reiniciado mas resetiado equipo queda operativo</w:t>
-      </w:r>
-    </w:p>
-    <w:p>
-      <w:pPr>
-        <w:spacing w:after="40" w:before="0"/>
-      </w:pPr>
-      <w:r>
-        <w:rPr>
-          <w:rFonts w:ascii="Calibri" w:hAnsi="Calibri" w:eastAsia="Calibri"/>
-          <w:b w:val="0"/>
-          <w:color w:val="555555"/>
-          <w:sz w:val="18"/>
-        </w:rPr>
-        <w:t>Respaldo: fila del Registro de fallas.</w:t>
-      </w:r>
-    </w:p>
-    <w:p>
-      <w:pPr>
-        <w:spacing w:after="120" w:before="0"/>
-      </w:pPr>
-      <w:r>
-        <w:rPr>
-          <w:rFonts w:ascii="Calibri" w:hAnsi="Calibri" w:eastAsia="Calibri"/>
-          <w:b w:val="0"/>
-          <w:color w:val="555555"/>
-          <w:sz w:val="18"/>
-        </w:rPr>
-        <w:t>Acta del día: MAE 05-01-2026</w:t>
-      </w:r>
-    </w:p>
-    <w:p>
-      <w:pPr>
-        <w:spacing w:after="40" w:before="0"/>
-      </w:pPr>
-      <w:r>
-        <w:rPr>
-          <w:rFonts w:ascii="Calibri" w:hAnsi="Calibri" w:eastAsia="Calibri"/>
-          <w:b/>
-          <w:color w:val="1F4E79"/>
-          <w:sz w:val="24"/>
-        </w:rPr>
-        <w:t>15-01-2026  —  Arauco El Bosque</w:t>
-      </w:r>
-    </w:p>
-    <w:p>
-      <w:pPr>
-        <w:spacing w:after="40" w:before="0"/>
-      </w:pPr>
-      <w:r>
-        <w:rPr>
-          <w:rFonts w:ascii="Calibri" w:hAnsi="Calibri" w:eastAsia="Calibri"/>
-          <w:b w:val="0"/>
-          <w:color w:val="444444"/>
-          <w:sz w:val="20"/>
-        </w:rPr>
-        <w:t>Técnico: No indicado en el registro.</w:t>
-      </w:r>
-    </w:p>
-    <w:p>
-      <w:pPr>
-        <w:spacing w:after="20" w:before="0"/>
-      </w:pPr>
-      <w:r>
-        <w:rPr>
-          <w:rFonts w:ascii="Calibri" w:hAnsi="Calibri" w:eastAsia="Calibri"/>
-          <w:b/>
-          <w:sz w:val="22"/>
-        </w:rPr>
-        <w:t>Acta de visita — Acta en Drive</w:t>
-      </w:r>
-    </w:p>
-    <w:p>
-      <w:pPr>
-        <w:spacing w:after="20" w:before="0"/>
-      </w:pPr>
-      <w:r>
-        <w:rPr>
-          <w:rFonts w:ascii="Calibri" w:hAnsi="Calibri" w:eastAsia="Calibri"/>
-          <w:b w:val="0"/>
-          <w:sz w:val="22"/>
-        </w:rPr>
-        <w:t>Respaldo fotográfico / acta en Drive (sin fila en el Registro de fallas).</w:t>
-      </w:r>
-    </w:p>
-    <w:p>
-      <w:pPr>
-        <w:spacing w:after="80" w:before="0"/>
-      </w:pPr>
-      <w:r>
-        <w:rPr>
-          <w:rFonts w:ascii="Calibri" w:hAnsi="Calibri" w:eastAsia="Calibri"/>
-          <w:b w:val="0"/>
-          <w:color w:val="555555"/>
-          <w:sz w:val="18"/>
-        </w:rPr>
-        <w:t>Respaldo: 15-01-2026 AEB</w:t>
-      </w:r>
-    </w:p>
-    <w:p>
-      <w:pPr>
-        <w:spacing w:after="40" w:before="0"/>
-      </w:pPr>
-      <w:r>
-        <w:rPr>
-          <w:rFonts w:ascii="Calibri" w:hAnsi="Calibri" w:eastAsia="Calibri"/>
-          <w:b/>
-          <w:color w:val="1F4E79"/>
-          <w:sz w:val="24"/>
-        </w:rPr>
-        <w:t>15-01-2026  —  Arauco Maipú</w:t>
-      </w:r>
-    </w:p>
-    <w:p>
-      <w:pPr>
-        <w:spacing w:after="40" w:before="0"/>
-      </w:pPr>
-      <w:r>
-        <w:rPr>
-          <w:rFonts w:ascii="Calibri" w:hAnsi="Calibri" w:eastAsia="Calibri"/>
-          <w:b w:val="0"/>
-          <w:color w:val="444444"/>
-          <w:sz w:val="20"/>
-        </w:rPr>
-        <w:t>Técnico: No indicado en el registro.</w:t>
-      </w:r>
-    </w:p>
-    <w:p>
-      <w:pPr>
-        <w:spacing w:after="20" w:before="0"/>
-      </w:pPr>
-      <w:r>
-        <w:rPr>
-          <w:rFonts w:ascii="Calibri" w:hAnsi="Calibri" w:eastAsia="Calibri"/>
-          <w:b/>
-          <w:sz w:val="22"/>
-        </w:rPr>
-        <w:t>Acta de visita — Acta en Drive</w:t>
-      </w:r>
-    </w:p>
-    <w:p>
-      <w:pPr>
-        <w:spacing w:after="20" w:before="0"/>
-      </w:pPr>
-      <w:r>
-        <w:rPr>
-          <w:rFonts w:ascii="Calibri" w:hAnsi="Calibri" w:eastAsia="Calibri"/>
-          <w:b w:val="0"/>
-          <w:sz w:val="22"/>
-        </w:rPr>
-        <w:t>Respaldo fotográfico / acta en Drive (sin fila en el Registro de fallas).</w:t>
-      </w:r>
-    </w:p>
-    <w:p>
-      <w:pPr>
-        <w:spacing w:after="80" w:before="0"/>
-      </w:pPr>
-      <w:r>
-        <w:rPr>
-          <w:rFonts w:ascii="Calibri" w:hAnsi="Calibri" w:eastAsia="Calibri"/>
-          <w:b w:val="0"/>
-          <w:color w:val="555555"/>
-          <w:sz w:val="18"/>
-        </w:rPr>
-        <w:t>Respaldo: 15-01-2026 MAM</w:t>
-      </w:r>
-    </w:p>
-    <w:p>
-      <w:pPr>
-        <w:spacing w:after="40" w:before="0"/>
-      </w:pPr>
-      <w:r>
-        <w:rPr>
-          <w:rFonts w:ascii="Calibri" w:hAnsi="Calibri" w:eastAsia="Calibri"/>
-          <w:b/>
-          <w:color w:val="1F4E79"/>
-          <w:sz w:val="24"/>
-        </w:rPr>
-        <w:t>19-01-2026  —  Arauco El Bosque</w:t>
-      </w:r>
-    </w:p>
-    <w:p>
-      <w:pPr>
-        <w:spacing w:after="40" w:before="0"/>
-      </w:pPr>
-      <w:r>
-        <w:rPr>
-          <w:rFonts w:ascii="Calibri" w:hAnsi="Calibri" w:eastAsia="Calibri"/>
-          <w:b w:val="0"/>
-          <w:color w:val="444444"/>
-          <w:sz w:val="20"/>
-        </w:rPr>
-        <w:t>Técnico: No indicado en el registro.</w:t>
-      </w:r>
-    </w:p>
-    <w:p>
-      <w:pPr>
-        <w:spacing w:after="20" w:before="0"/>
-      </w:pPr>
-      <w:r>
-        <w:rPr>
-          <w:rFonts w:ascii="Calibri" w:hAnsi="Calibri" w:eastAsia="Calibri"/>
-          <w:b/>
-          <w:sz w:val="22"/>
-        </w:rPr>
-        <w:t>Acta de visita — Acta en Drive</w:t>
-      </w:r>
-    </w:p>
-    <w:p>
-      <w:pPr>
-        <w:spacing w:after="20" w:before="0"/>
-      </w:pPr>
-      <w:r>
-        <w:rPr>
-          <w:rFonts w:ascii="Calibri" w:hAnsi="Calibri" w:eastAsia="Calibri"/>
-          <w:b w:val="0"/>
-          <w:sz w:val="22"/>
-        </w:rPr>
-        <w:t>Respaldo fotográfico / acta en Drive (sin fila en el Registro de fallas).</w:t>
-      </w:r>
-    </w:p>
-    <w:p>
-      <w:pPr>
-        <w:spacing w:after="80" w:before="0"/>
-      </w:pPr>
-      <w:r>
-        <w:rPr>
-          <w:rFonts w:ascii="Calibri" w:hAnsi="Calibri" w:eastAsia="Calibri"/>
-          <w:b w:val="0"/>
-          <w:color w:val="555555"/>
-          <w:sz w:val="18"/>
-        </w:rPr>
-        <w:t>Respaldo: 19-01-2026 AEB</w:t>
-      </w:r>
-    </w:p>
-    <w:p>
-      <w:pPr>
-        <w:spacing w:after="40" w:before="0"/>
-      </w:pPr>
-      <w:r>
-        <w:rPr>
-          <w:rFonts w:ascii="Calibri" w:hAnsi="Calibri" w:eastAsia="Calibri"/>
-          <w:b/>
-          <w:color w:val="1F4E79"/>
-          <w:sz w:val="24"/>
-        </w:rPr>
-        <w:t>19-01-2026  —  Arauco Maipú</w:t>
-      </w:r>
-    </w:p>
-    <w:p>
-      <w:pPr>
-        <w:spacing w:after="40" w:before="0"/>
-      </w:pPr>
-      <w:r>
-        <w:rPr>
-          <w:rFonts w:ascii="Calibri" w:hAnsi="Calibri" w:eastAsia="Calibri"/>
-          <w:b w:val="0"/>
-          <w:color w:val="444444"/>
-          <w:sz w:val="20"/>
-        </w:rPr>
-        <w:t>Técnico: No indicado en el registro.</w:t>
-      </w:r>
-    </w:p>
-    <w:p>
-      <w:pPr>
-        <w:spacing w:after="20" w:before="0"/>
-      </w:pPr>
-      <w:r>
-        <w:rPr>
-          <w:rFonts w:ascii="Calibri" w:hAnsi="Calibri" w:eastAsia="Calibri"/>
-          <w:b/>
-          <w:sz w:val="22"/>
-        </w:rPr>
-        <w:t>Acta de visita — Acta en Drive</w:t>
-      </w:r>
-    </w:p>
-    <w:p>
-      <w:pPr>
-        <w:spacing w:after="20" w:before="0"/>
-      </w:pPr>
-      <w:r>
-        <w:rPr>
-          <w:rFonts w:ascii="Calibri" w:hAnsi="Calibri" w:eastAsia="Calibri"/>
-          <w:b w:val="0"/>
-          <w:sz w:val="22"/>
-        </w:rPr>
-        <w:t>Respaldo fotográfico / acta en Drive (sin fila en el Registro de fallas).</w:t>
-      </w:r>
-    </w:p>
-    <w:p>
-      <w:pPr>
-        <w:spacing w:after="80" w:before="0"/>
-      </w:pPr>
-      <w:r>
-        <w:rPr>
-          <w:rFonts w:ascii="Calibri" w:hAnsi="Calibri" w:eastAsia="Calibri"/>
-          <w:b w:val="0"/>
-          <w:color w:val="555555"/>
-          <w:sz w:val="18"/>
-        </w:rPr>
-        <w:t>Respaldo: 19-01-2026 MAM</w:t>
+        <w:t>Router con problema de comunicación. Se reinicia y se resetea. El equipo queda operativo.</w:t>
       </w:r>
     </w:p>
     <w:p>
@@ -1242,12 +942,12 @@
           <w:b/>
           <w:sz w:val="22"/>
         </w:rPr>
-        <w:t>ESTANQUE CARGA ESTANQUE SUR — Mtto Preventivo — Hídrica</w:t>
+        <w:t>KFC — baño de guardias</w:t>
       </w:r>
     </w:p>
     <w:p>
       <w:pPr>
-        <w:spacing w:after="20" w:before="0"/>
+        <w:spacing w:after="60" w:before="0"/>
       </w:pPr>
       <w:r>
         <w:rPr>
@@ -1255,12 +955,12 @@
           <w:b w:val="0"/>
           <w:sz w:val="22"/>
         </w:rPr>
-        <w:t>instalacion de collerin en sala de bombas sur.</w:t>
+        <w:t>Reparación de fuga en codo de bronce.</w:t>
       </w:r>
     </w:p>
     <w:p>
       <w:pPr>
-        <w:spacing w:after="40" w:before="0"/>
+        <w:spacing w:after="120" w:before="0"/>
       </w:pPr>
       <w:r>
         <w:rPr>
@@ -1269,101 +969,7 @@
           <w:color w:val="555555"/>
           <w:sz w:val="18"/>
         </w:rPr>
-        <w:t>Respaldo: fila del Registro de fallas.</w:t>
-      </w:r>
-    </w:p>
-    <w:p>
-      <w:pPr>
-        <w:spacing w:after="20" w:before="0"/>
-      </w:pPr>
-      <w:r>
-        <w:rPr>
-          <w:rFonts w:ascii="Calibri" w:hAnsi="Calibri" w:eastAsia="Calibri"/>
-          <w:b/>
-          <w:sz w:val="22"/>
-        </w:rPr>
-        <w:t>KFC — Mtto Correctivo — Hídrica — Reparación</w:t>
-      </w:r>
-    </w:p>
-    <w:p>
-      <w:pPr>
-        <w:spacing w:after="20" w:before="0"/>
-      </w:pPr>
-      <w:r>
-        <w:rPr>
-          <w:rFonts w:ascii="Calibri" w:hAnsi="Calibri" w:eastAsia="Calibri"/>
-          <w:b w:val="0"/>
-          <w:sz w:val="22"/>
-        </w:rPr>
-        <w:t>intervencion se pide cambio de materialidad en instalaion baño guardias de pvc a ppr.</w:t>
-      </w:r>
-    </w:p>
-    <w:p>
-      <w:pPr>
-        <w:spacing w:after="40" w:before="0"/>
-      </w:pPr>
-      <w:r>
-        <w:rPr>
-          <w:rFonts w:ascii="Calibri" w:hAnsi="Calibri" w:eastAsia="Calibri"/>
-          <w:b w:val="0"/>
-          <w:color w:val="555555"/>
-          <w:sz w:val="18"/>
-        </w:rPr>
-        <w:t>Respaldo: fila del Registro de fallas.</w:t>
-      </w:r>
-    </w:p>
-    <w:p>
-      <w:pPr>
-        <w:spacing w:after="20" w:before="0"/>
-      </w:pPr>
-      <w:r>
-        <w:rPr>
-          <w:rFonts w:ascii="Calibri" w:hAnsi="Calibri" w:eastAsia="Calibri"/>
-          <w:b/>
-          <w:sz w:val="22"/>
-        </w:rPr>
-        <w:t>KFC — Mtto Correctivo — Hídrica — Reparación</w:t>
-      </w:r>
-    </w:p>
-    <w:p>
-      <w:pPr>
-        <w:spacing w:after="20" w:before="0"/>
-      </w:pPr>
-      <w:r>
-        <w:rPr>
-          <w:rFonts w:ascii="Calibri" w:hAnsi="Calibri" w:eastAsia="Calibri"/>
-          <w:b w:val="0"/>
-          <w:sz w:val="22"/>
-        </w:rPr>
-        <w:t>instalacion de gabinete cir mas canalisacion tranductores mas control de valvulas reparacion de fuga en odo bronce baño de guardias</w:t>
-      </w:r>
-    </w:p>
-    <w:p>
-      <w:pPr>
-        <w:spacing w:after="40" w:before="0"/>
-      </w:pPr>
-      <w:r>
-        <w:rPr>
-          <w:rFonts w:ascii="Calibri" w:hAnsi="Calibri" w:eastAsia="Calibri"/>
-          <w:b w:val="0"/>
-          <w:color w:val="555555"/>
-          <w:sz w:val="18"/>
-        </w:rPr>
-        <w:t>Respaldo: fila del Registro de fallas.</w:t>
-      </w:r>
-    </w:p>
-    <w:p>
-      <w:pPr>
-        <w:spacing w:after="120" w:before="0"/>
-      </w:pPr>
-      <w:r>
-        <w:rPr>
-          <w:rFonts w:ascii="Calibri" w:hAnsi="Calibri" w:eastAsia="Calibri"/>
-          <w:b w:val="0"/>
-          <w:color w:val="555555"/>
-          <w:sz w:val="18"/>
-        </w:rPr>
-        <w:t>Acta del día: 22-01-2026 MAE</w:t>
+        <w:t>El mismo día se instaló un collarín en la sala de bombas sur. Esa instalación no se cuenta.</w:t>
       </w:r>
     </w:p>
     <w:p>
@@ -1404,12 +1010,12 @@
           <w:b/>
           <w:sz w:val="22"/>
         </w:rPr>
-        <w:t>PIZZA HUT — Mtto Correctivo — Hídrica</w:t>
+        <w:t>Pizza Hut</w:t>
       </w:r>
     </w:p>
     <w:p>
       <w:pPr>
-        <w:spacing w:after="20" w:before="0"/>
+        <w:spacing w:after="60" w:before="0"/>
       </w:pPr>
       <w:r>
         <w:rPr>
@@ -1417,171 +1023,7 @@
           <w:b w:val="0"/>
           <w:sz w:val="22"/>
         </w:rPr>
-        <w:t>cambio de manguera despiche valvula, esta es extendida hasta el exterir de local.</w:t>
-      </w:r>
-    </w:p>
-    <w:p>
-      <w:pPr>
-        <w:spacing w:after="40" w:before="0"/>
-      </w:pPr>
-      <w:r>
-        <w:rPr>
-          <w:rFonts w:ascii="Calibri" w:hAnsi="Calibri" w:eastAsia="Calibri"/>
-          <w:b w:val="0"/>
-          <w:color w:val="555555"/>
-          <w:sz w:val="18"/>
-        </w:rPr>
-        <w:t>Respaldo: fila del Registro de fallas.</w:t>
-      </w:r>
-    </w:p>
-    <w:p>
-      <w:pPr>
-        <w:spacing w:after="120" w:before="0"/>
-      </w:pPr>
-      <w:r>
-        <w:rPr>
-          <w:rFonts w:ascii="Calibri" w:hAnsi="Calibri" w:eastAsia="Calibri"/>
-          <w:b w:val="0"/>
-          <w:color w:val="555555"/>
-          <w:sz w:val="18"/>
-        </w:rPr>
-        <w:t>Acta del día: 23-01-2026 MAE</w:t>
-      </w:r>
-    </w:p>
-    <w:p>
-      <w:pPr>
-        <w:spacing w:after="40" w:before="0"/>
-      </w:pPr>
-      <w:r>
-        <w:rPr>
-          <w:rFonts w:ascii="Calibri" w:hAnsi="Calibri" w:eastAsia="Calibri"/>
-          <w:b/>
-          <w:color w:val="1F4E79"/>
-          <w:sz w:val="24"/>
-        </w:rPr>
-        <w:t>23-01-2026  —  Arauco Maipú</w:t>
-      </w:r>
-    </w:p>
-    <w:p>
-      <w:pPr>
-        <w:spacing w:after="40" w:before="0"/>
-      </w:pPr>
-      <w:r>
-        <w:rPr>
-          <w:rFonts w:ascii="Calibri" w:hAnsi="Calibri" w:eastAsia="Calibri"/>
-          <w:b w:val="0"/>
-          <w:color w:val="444444"/>
-          <w:sz w:val="20"/>
-        </w:rPr>
-        <w:t>Técnico: No indicado en el registro.</w:t>
-      </w:r>
-    </w:p>
-    <w:p>
-      <w:pPr>
-        <w:spacing w:after="20" w:before="0"/>
-      </w:pPr>
-      <w:r>
-        <w:rPr>
-          <w:rFonts w:ascii="Calibri" w:hAnsi="Calibri" w:eastAsia="Calibri"/>
-          <w:b/>
-          <w:sz w:val="22"/>
-        </w:rPr>
-        <w:t>Acta de visita — Acta en Drive</w:t>
-      </w:r>
-    </w:p>
-    <w:p>
-      <w:pPr>
-        <w:spacing w:after="20" w:before="0"/>
-      </w:pPr>
-      <w:r>
-        <w:rPr>
-          <w:rFonts w:ascii="Calibri" w:hAnsi="Calibri" w:eastAsia="Calibri"/>
-          <w:b w:val="0"/>
-          <w:sz w:val="22"/>
-        </w:rPr>
-        <w:t>Respaldo fotográfico / acta en Drive (sin fila en el Registro de fallas).</w:t>
-      </w:r>
-    </w:p>
-    <w:p>
-      <w:pPr>
-        <w:spacing w:after="80" w:before="0"/>
-      </w:pPr>
-      <w:r>
-        <w:rPr>
-          <w:rFonts w:ascii="Calibri" w:hAnsi="Calibri" w:eastAsia="Calibri"/>
-          <w:b w:val="0"/>
-          <w:color w:val="555555"/>
-          <w:sz w:val="18"/>
-        </w:rPr>
-        <w:t>Respaldo: 23-01-2026 MAM</w:t>
-      </w:r>
-    </w:p>
-    <w:p>
-      <w:pPr>
-        <w:spacing w:after="40" w:before="0"/>
-      </w:pPr>
-      <w:r>
-        <w:rPr>
-          <w:rFonts w:ascii="Calibri" w:hAnsi="Calibri" w:eastAsia="Calibri"/>
-          <w:b/>
-          <w:color w:val="1F4E79"/>
-          <w:sz w:val="24"/>
-        </w:rPr>
-        <w:t>26-01-2026  —  Arauco Maipú</w:t>
-      </w:r>
-    </w:p>
-    <w:p>
-      <w:pPr>
-        <w:spacing w:after="40" w:before="0"/>
-      </w:pPr>
-      <w:r>
-        <w:rPr>
-          <w:rFonts w:ascii="Calibri" w:hAnsi="Calibri" w:eastAsia="Calibri"/>
-          <w:b w:val="0"/>
-          <w:color w:val="444444"/>
-          <w:sz w:val="20"/>
-        </w:rPr>
-        <w:t>Técnico: No indicado en el registro.</w:t>
-      </w:r>
-    </w:p>
-    <w:p>
-      <w:pPr>
-        <w:spacing w:after="20" w:before="0"/>
-      </w:pPr>
-      <w:r>
-        <w:rPr>
-          <w:rFonts w:ascii="Calibri" w:hAnsi="Calibri" w:eastAsia="Calibri"/>
-          <w:b/>
-          <w:sz w:val="22"/>
-        </w:rPr>
-        <w:t>Acta de visita — Acta en Drive</w:t>
-      </w:r>
-    </w:p>
-    <w:p>
-      <w:pPr>
-        <w:spacing w:after="20" w:before="0"/>
-      </w:pPr>
-      <w:r>
-        <w:rPr>
-          <w:rFonts w:ascii="Calibri" w:hAnsi="Calibri" w:eastAsia="Calibri"/>
-          <w:b w:val="0"/>
-          <w:sz w:val="22"/>
-        </w:rPr>
-        <w:t>Respaldo fotográfico / acta en Drive (sin fila en el Registro de fallas).</w:t>
-      </w:r>
-    </w:p>
-    <w:p>
-      <w:pPr>
-        <w:spacing w:after="80" w:before="0"/>
-      </w:pPr>
-      <w:r>
-        <w:rPr>
-          <w:rFonts w:ascii="Calibri" w:hAnsi="Calibri" w:eastAsia="Calibri"/>
-          <w:b w:val="0"/>
-          <w:color w:val="555555"/>
-          <w:sz w:val="18"/>
-        </w:rPr>
-        <w:t>Respaldo: 26-01-2026 MAM</w:t>
+        <w:t>Cambio de la manguera de desagüe del solenoide. Se alarga hasta el exterior del local.</w:t>
       </w:r>
     </w:p>
     <w:p>
@@ -1609,7 +1051,7 @@
           <w:color w:val="1F4E79"/>
           <w:sz w:val="24"/>
         </w:rPr>
-        <w:t>02-02-2026  —  Arauco Maipú</w:t>
+        <w:t>05-02-2026  —  Arauco Estación</w:t>
       </w:r>
     </w:p>
     <w:p>
@@ -1623,7 +1065,7 @@
           <w:color w:val="444444"/>
           <w:sz w:val="20"/>
         </w:rPr>
-        <w:t>Técnico: No indicado en el registro. Acta archivada en la carpeta Arauco Quilicura.</w:t>
+        <w:t>Técnico: No identificado en el acta (recibe Sergio Fuenzalida).</w:t>
       </w:r>
     </w:p>
     <w:p>
@@ -1636,12 +1078,12 @@
           <w:b/>
           <w:sz w:val="22"/>
         </w:rPr>
-        <w:t>Acta de visita — Acta en Drive</w:t>
+        <w:t>Baño de guardias</w:t>
       </w:r>
     </w:p>
     <w:p>
       <w:pPr>
-        <w:spacing w:after="20" w:before="0"/>
+        <w:spacing w:after="60" w:before="0"/>
       </w:pPr>
       <w:r>
         <w:rPr>
@@ -1649,361 +1091,7 @@
           <w:b w:val="0"/>
           <w:sz w:val="22"/>
         </w:rPr>
-        <w:t>Respaldo fotográfico / acta en Drive (sin fila en el Registro de fallas).</w:t>
-      </w:r>
-    </w:p>
-    <w:p>
-      <w:pPr>
-        <w:spacing w:after="80" w:before="0"/>
-      </w:pPr>
-      <w:r>
-        <w:rPr>
-          <w:rFonts w:ascii="Calibri" w:hAnsi="Calibri" w:eastAsia="Calibri"/>
-          <w:b w:val="0"/>
-          <w:color w:val="555555"/>
-          <w:sz w:val="18"/>
-        </w:rPr>
-        <w:t>Respaldo: 02-02-2026 MAM</w:t>
-      </w:r>
-    </w:p>
-    <w:p>
-      <w:pPr>
-        <w:spacing w:after="40" w:before="0"/>
-      </w:pPr>
-      <w:r>
-        <w:rPr>
-          <w:rFonts w:ascii="Calibri" w:hAnsi="Calibri" w:eastAsia="Calibri"/>
-          <w:b/>
-          <w:color w:val="1F4E79"/>
-          <w:sz w:val="24"/>
-        </w:rPr>
-        <w:t>05-02-2026  —  Arauco Estación</w:t>
-      </w:r>
-    </w:p>
-    <w:p>
-      <w:pPr>
-        <w:spacing w:after="40" w:before="0"/>
-      </w:pPr>
-      <w:r>
-        <w:rPr>
-          <w:rFonts w:ascii="Calibri" w:hAnsi="Calibri" w:eastAsia="Calibri"/>
-          <w:b w:val="0"/>
-          <w:color w:val="444444"/>
-          <w:sz w:val="20"/>
-        </w:rPr>
-        <w:t>Técnico: No indicado en el registro.</w:t>
-      </w:r>
-    </w:p>
-    <w:p>
-      <w:pPr>
-        <w:spacing w:after="20" w:before="0"/>
-      </w:pPr>
-      <w:r>
-        <w:rPr>
-          <w:rFonts w:ascii="Calibri" w:hAnsi="Calibri" w:eastAsia="Calibri"/>
-          <w:b/>
-          <w:sz w:val="22"/>
-        </w:rPr>
-        <w:t>baño guardias — Acta en Drive</w:t>
-      </w:r>
-    </w:p>
-    <w:p>
-      <w:pPr>
-        <w:spacing w:after="20" w:before="0"/>
-      </w:pPr>
-      <w:r>
-        <w:rPr>
-          <w:rFonts w:ascii="Calibri" w:hAnsi="Calibri" w:eastAsia="Calibri"/>
-          <w:b w:val="0"/>
-          <w:sz w:val="22"/>
-        </w:rPr>
-        <w:t>Respaldo en Drive (sin fila en el Registro de fallas).</w:t>
-      </w:r>
-    </w:p>
-    <w:p>
-      <w:pPr>
-        <w:spacing w:after="80" w:before="0"/>
-      </w:pPr>
-      <w:r>
-        <w:rPr>
-          <w:rFonts w:ascii="Calibri" w:hAnsi="Calibri" w:eastAsia="Calibri"/>
-          <w:b w:val="0"/>
-          <w:color w:val="555555"/>
-          <w:sz w:val="18"/>
-        </w:rPr>
-        <w:t>Respaldo: 05-02-2026 Mae baño guardias</w:t>
-      </w:r>
-    </w:p>
-    <w:p>
-      <w:pPr>
-        <w:spacing w:after="40" w:before="0"/>
-      </w:pPr>
-      <w:r>
-        <w:rPr>
-          <w:rFonts w:ascii="Calibri" w:hAnsi="Calibri" w:eastAsia="Calibri"/>
-          <w:b/>
-          <w:color w:val="1F4E79"/>
-          <w:sz w:val="24"/>
-        </w:rPr>
-        <w:t>10-02-2026  —  Arauco Quilicura</w:t>
-      </w:r>
-    </w:p>
-    <w:p>
-      <w:pPr>
-        <w:spacing w:after="40" w:before="0"/>
-      </w:pPr>
-      <w:r>
-        <w:rPr>
-          <w:rFonts w:ascii="Calibri" w:hAnsi="Calibri" w:eastAsia="Calibri"/>
-          <w:b w:val="0"/>
-          <w:color w:val="444444"/>
-          <w:sz w:val="20"/>
-        </w:rPr>
-        <w:t>Técnico: No indicado en el registro.</w:t>
-      </w:r>
-    </w:p>
-    <w:p>
-      <w:pPr>
-        <w:spacing w:after="20" w:before="0"/>
-      </w:pPr>
-      <w:r>
-        <w:rPr>
-          <w:rFonts w:ascii="Calibri" w:hAnsi="Calibri" w:eastAsia="Calibri"/>
-          <w:b/>
-          <w:sz w:val="22"/>
-        </w:rPr>
-        <w:t>Acta de visita — Acta en Drive</w:t>
-      </w:r>
-    </w:p>
-    <w:p>
-      <w:pPr>
-        <w:spacing w:after="20" w:before="0"/>
-      </w:pPr>
-      <w:r>
-        <w:rPr>
-          <w:rFonts w:ascii="Calibri" w:hAnsi="Calibri" w:eastAsia="Calibri"/>
-          <w:b w:val="0"/>
-          <w:sz w:val="22"/>
-        </w:rPr>
-        <w:t>Respaldo fotográfico / acta en Drive (sin fila en el Registro de fallas).</w:t>
-      </w:r>
-    </w:p>
-    <w:p>
-      <w:pPr>
-        <w:spacing w:after="80" w:before="0"/>
-      </w:pPr>
-      <w:r>
-        <w:rPr>
-          <w:rFonts w:ascii="Calibri" w:hAnsi="Calibri" w:eastAsia="Calibri"/>
-          <w:b w:val="0"/>
-          <w:color w:val="555555"/>
-          <w:sz w:val="18"/>
-        </w:rPr>
-        <w:t>Respaldo: 10-02-2026 MAQ</w:t>
-      </w:r>
-    </w:p>
-    <w:p>
-      <w:pPr>
-        <w:spacing w:after="40" w:before="0"/>
-      </w:pPr>
-      <w:r>
-        <w:rPr>
-          <w:rFonts w:ascii="Calibri" w:hAnsi="Calibri" w:eastAsia="Calibri"/>
-          <w:b/>
-          <w:color w:val="1F4E79"/>
-          <w:sz w:val="24"/>
-        </w:rPr>
-        <w:t>10-02-2026  —  Parque Arauco Kennedy</w:t>
-      </w:r>
-    </w:p>
-    <w:p>
-      <w:pPr>
-        <w:spacing w:after="40" w:before="0"/>
-      </w:pPr>
-      <w:r>
-        <w:rPr>
-          <w:rFonts w:ascii="Calibri" w:hAnsi="Calibri" w:eastAsia="Calibri"/>
-          <w:b w:val="0"/>
-          <w:color w:val="444444"/>
-          <w:sz w:val="20"/>
-        </w:rPr>
-        <w:t>Técnico: No indicado en el registro.</w:t>
-      </w:r>
-    </w:p>
-    <w:p>
-      <w:pPr>
-        <w:spacing w:after="20" w:before="0"/>
-      </w:pPr>
-      <w:r>
-        <w:rPr>
-          <w:rFonts w:ascii="Calibri" w:hAnsi="Calibri" w:eastAsia="Calibri"/>
-          <w:b/>
-          <w:sz w:val="22"/>
-        </w:rPr>
-        <w:t>Baño Varones y Dama — Acta en Drive</w:t>
-      </w:r>
-    </w:p>
-    <w:p>
-      <w:pPr>
-        <w:spacing w:after="20" w:before="0"/>
-      </w:pPr>
-      <w:r>
-        <w:rPr>
-          <w:rFonts w:ascii="Calibri" w:hAnsi="Calibri" w:eastAsia="Calibri"/>
-          <w:b w:val="0"/>
-          <w:sz w:val="22"/>
-        </w:rPr>
-        <w:t>Respaldo en Drive (sin fila en el Registro de fallas).</w:t>
-      </w:r>
-    </w:p>
-    <w:p>
-      <w:pPr>
-        <w:spacing w:after="80" w:before="0"/>
-      </w:pPr>
-      <w:r>
-        <w:rPr>
-          <w:rFonts w:ascii="Calibri" w:hAnsi="Calibri" w:eastAsia="Calibri"/>
-          <w:b w:val="0"/>
-          <w:color w:val="555555"/>
-          <w:sz w:val="18"/>
-        </w:rPr>
-        <w:t>Respaldo: PAK Baño Varones y Dama 10-02-26</w:t>
-      </w:r>
-    </w:p>
-    <w:p>
-      <w:pPr>
-        <w:spacing w:after="40" w:before="0"/>
-      </w:pPr>
-      <w:r>
-        <w:rPr>
-          <w:rFonts w:ascii="Calibri" w:hAnsi="Calibri" w:eastAsia="Calibri"/>
-          <w:b/>
-          <w:color w:val="1F4E79"/>
-          <w:sz w:val="24"/>
-        </w:rPr>
-        <w:t>17-02-2026  —  Arauco Quilicura</w:t>
-      </w:r>
-    </w:p>
-    <w:p>
-      <w:pPr>
-        <w:spacing w:after="40" w:before="0"/>
-      </w:pPr>
-      <w:r>
-        <w:rPr>
-          <w:rFonts w:ascii="Calibri" w:hAnsi="Calibri" w:eastAsia="Calibri"/>
-          <w:b w:val="0"/>
-          <w:color w:val="444444"/>
-          <w:sz w:val="20"/>
-        </w:rPr>
-        <w:t>Técnico: No indicado en el registro.</w:t>
-      </w:r>
-    </w:p>
-    <w:p>
-      <w:pPr>
-        <w:spacing w:after="20" w:before="0"/>
-      </w:pPr>
-      <w:r>
-        <w:rPr>
-          <w:rFonts w:ascii="Calibri" w:hAnsi="Calibri" w:eastAsia="Calibri"/>
-          <w:b/>
-          <w:sz w:val="22"/>
-        </w:rPr>
-        <w:t>Reubicación red de incendio — Acta en Drive</w:t>
-      </w:r>
-    </w:p>
-    <w:p>
-      <w:pPr>
-        <w:spacing w:after="20" w:before="0"/>
-      </w:pPr>
-      <w:r>
-        <w:rPr>
-          <w:rFonts w:ascii="Calibri" w:hAnsi="Calibri" w:eastAsia="Calibri"/>
-          <w:b w:val="0"/>
-          <w:sz w:val="22"/>
-        </w:rPr>
-        <w:t>Respaldo en Drive (sin fila en el Registro de fallas).</w:t>
-      </w:r>
-    </w:p>
-    <w:p>
-      <w:pPr>
-        <w:spacing w:after="80" w:before="0"/>
-      </w:pPr>
-      <w:r>
-        <w:rPr>
-          <w:rFonts w:ascii="Calibri" w:hAnsi="Calibri" w:eastAsia="Calibri"/>
-          <w:b w:val="0"/>
-          <w:color w:val="555555"/>
-          <w:sz w:val="18"/>
-        </w:rPr>
-        <w:t>Respaldo: Reubicación red de incendio 17-02-26</w:t>
-      </w:r>
-    </w:p>
-    <w:p>
-      <w:pPr>
-        <w:spacing w:after="40" w:before="0"/>
-      </w:pPr>
-      <w:r>
-        <w:rPr>
-          <w:rFonts w:ascii="Calibri" w:hAnsi="Calibri" w:eastAsia="Calibri"/>
-          <w:b/>
-          <w:color w:val="1F4E79"/>
-          <w:sz w:val="24"/>
-        </w:rPr>
-        <w:t>23-02-2026  —  Arauco Estación</w:t>
-      </w:r>
-    </w:p>
-    <w:p>
-      <w:pPr>
-        <w:spacing w:after="40" w:before="0"/>
-      </w:pPr>
-      <w:r>
-        <w:rPr>
-          <w:rFonts w:ascii="Calibri" w:hAnsi="Calibri" w:eastAsia="Calibri"/>
-          <w:b w:val="0"/>
-          <w:color w:val="444444"/>
-          <w:sz w:val="20"/>
-        </w:rPr>
-        <w:t>Técnico: No indicado en el registro.</w:t>
-      </w:r>
-    </w:p>
-    <w:p>
-      <w:pPr>
-        <w:spacing w:after="20" w:before="0"/>
-      </w:pPr>
-      <w:r>
-        <w:rPr>
-          <w:rFonts w:ascii="Calibri" w:hAnsi="Calibri" w:eastAsia="Calibri"/>
-          <w:b/>
-          <w:sz w:val="22"/>
-        </w:rPr>
-        <w:t>Visita técnica — Visita técnica</w:t>
-      </w:r>
-    </w:p>
-    <w:p>
-      <w:pPr>
-        <w:spacing w:after="20" w:before="0"/>
-      </w:pPr>
-      <w:r>
-        <w:rPr>
-          <w:rFonts w:ascii="Calibri" w:hAnsi="Calibri" w:eastAsia="Calibri"/>
-          <w:b w:val="0"/>
-          <w:sz w:val="22"/>
-        </w:rPr>
-        <w:t>Informe de visita técnica (fecha de visita 23-02-2026)</w:t>
-      </w:r>
-    </w:p>
-    <w:p>
-      <w:pPr>
-        <w:spacing w:after="80" w:before="0"/>
-      </w:pPr>
-      <w:r>
-        <w:rPr>
-          <w:rFonts w:ascii="Calibri" w:hAnsi="Calibri" w:eastAsia="Calibri"/>
-          <w:b w:val="0"/>
-          <w:color w:val="555555"/>
-          <w:sz w:val="18"/>
-        </w:rPr>
-        <w:t>Respaldo: Informe Visita técnicas - MAE (05.03.2026).docx; Informe Visita técnicas - MAE (23.03.2026).docx</w:t>
+        <w:t>Desconexión por ruido eléctrico en la placa y desprogramación. Se reprograma y el equipo queda conectado.</w:t>
       </w:r>
     </w:p>
     <w:p>
@@ -2045,7 +1133,7 @@
           <w:color w:val="444444"/>
           <w:sz w:val="20"/>
         </w:rPr>
-        <w:t>Técnico: No indicado en el registro.</w:t>
+        <w:t>Técnico: No identificado en el acta.</w:t>
       </w:r>
     </w:p>
     <w:p>
@@ -2058,12 +1146,12 @@
           <w:b/>
           <w:sz w:val="22"/>
         </w:rPr>
-        <w:t>Acta de visita — Acta en Drive</w:t>
+        <w:t>Baño varones N°6</w:t>
       </w:r>
     </w:p>
     <w:p>
       <w:pPr>
-        <w:spacing w:after="20" w:before="0"/>
+        <w:spacing w:after="60" w:before="0"/>
       </w:pPr>
       <w:r>
         <w:rPr>
@@ -2071,12 +1159,12 @@
           <w:b w:val="0"/>
           <w:sz w:val="22"/>
         </w:rPr>
-        <w:t>Respaldo fotográfico / acta en Drive (sin fila en el Registro de fallas).</w:t>
+        <w:t>El sistema estaba desenchufado. No hay data desde el 18-02-2026.</w:t>
       </w:r>
     </w:p>
     <w:p>
       <w:pPr>
-        <w:spacing w:after="80" w:before="0"/>
+        <w:spacing w:after="120" w:before="0"/>
       </w:pPr>
       <w:r>
         <w:rPr>
@@ -2085,87 +1173,7 @@
           <w:color w:val="555555"/>
           <w:sz w:val="18"/>
         </w:rPr>
-        <w:t>Respaldo: PAK DL 04-03-26</w:t>
-      </w:r>
-    </w:p>
-    <w:p>
-      <w:pPr>
-        <w:spacing w:after="20" w:before="0"/>
-      </w:pPr>
-      <w:r>
-        <w:rPr>
-          <w:rFonts w:ascii="Calibri" w:hAnsi="Calibri" w:eastAsia="Calibri"/>
-          <w:b/>
-          <w:sz w:val="22"/>
-        </w:rPr>
-        <w:t>impulsión Fredo — Acta en Drive</w:t>
-      </w:r>
-    </w:p>
-    <w:p>
-      <w:pPr>
-        <w:spacing w:after="20" w:before="0"/>
-      </w:pPr>
-      <w:r>
-        <w:rPr>
-          <w:rFonts w:ascii="Calibri" w:hAnsi="Calibri" w:eastAsia="Calibri"/>
-          <w:b w:val="0"/>
-          <w:sz w:val="22"/>
-        </w:rPr>
-        <w:t>Respaldo en Drive (sin fila en el Registro de fallas).</w:t>
-      </w:r>
-    </w:p>
-    <w:p>
-      <w:pPr>
-        <w:spacing w:after="80" w:before="0"/>
-      </w:pPr>
-      <w:r>
-        <w:rPr>
-          <w:rFonts w:ascii="Calibri" w:hAnsi="Calibri" w:eastAsia="Calibri"/>
-          <w:b w:val="0"/>
-          <w:color w:val="555555"/>
-          <w:sz w:val="18"/>
-        </w:rPr>
-        <w:t>Respaldo: PAK impulsión Fredo 04-03-26</w:t>
-      </w:r>
-    </w:p>
-    <w:p>
-      <w:pPr>
-        <w:spacing w:after="20" w:before="0"/>
-      </w:pPr>
-      <w:r>
-        <w:rPr>
-          <w:rFonts w:ascii="Calibri" w:hAnsi="Calibri" w:eastAsia="Calibri"/>
-          <w:b/>
-          <w:sz w:val="22"/>
-        </w:rPr>
-        <w:t>baño varones N6 — Acta en Drive</w:t>
-      </w:r>
-    </w:p>
-    <w:p>
-      <w:pPr>
-        <w:spacing w:after="20" w:before="0"/>
-      </w:pPr>
-      <w:r>
-        <w:rPr>
-          <w:rFonts w:ascii="Calibri" w:hAnsi="Calibri" w:eastAsia="Calibri"/>
-          <w:b w:val="0"/>
-          <w:sz w:val="22"/>
-        </w:rPr>
-        <w:t>Respaldo en Drive (sin fila en el Registro de fallas).</w:t>
-      </w:r>
-    </w:p>
-    <w:p>
-      <w:pPr>
-        <w:spacing w:after="80" w:before="0"/>
-      </w:pPr>
-      <w:r>
-        <w:rPr>
-          <w:rFonts w:ascii="Calibri" w:hAnsi="Calibri" w:eastAsia="Calibri"/>
-          <w:b w:val="0"/>
-          <w:color w:val="555555"/>
-          <w:sz w:val="18"/>
-        </w:rPr>
-        <w:t>Respaldo: PAK baño varones N6 04-03-26</w:t>
+        <w:t>El mismo día se revisaron DL e impulsión Fredo y quedaron operativos, sin defecto.</w:t>
       </w:r>
     </w:p>
     <w:p>
@@ -2193,7 +1201,7 @@
           <w:color w:val="444444"/>
           <w:sz w:val="20"/>
         </w:rPr>
-        <w:t>Técnico: No indicado en el registro.</w:t>
+        <w:t>Técnico: Mario Froitez P..</w:t>
       </w:r>
     </w:p>
     <w:p>
@@ -2206,12 +1214,12 @@
           <w:b/>
           <w:sz w:val="22"/>
         </w:rPr>
-        <w:t>Acta de visita — Acta en Drive</w:t>
+        <w:t>Tubería PPR</w:t>
       </w:r>
     </w:p>
     <w:p>
       <w:pPr>
-        <w:spacing w:after="20" w:before="0"/>
+        <w:spacing w:after="60" w:before="0"/>
       </w:pPr>
       <w:r>
         <w:rPr>
@@ -2219,89 +1227,7 @@
           <w:b w:val="0"/>
           <w:sz w:val="22"/>
         </w:rPr>
-        <w:t>Respaldo fotográfico / acta en Drive (sin fila en el Registro de fallas).</w:t>
-      </w:r>
-    </w:p>
-    <w:p>
-      <w:pPr>
-        <w:spacing w:after="80" w:before="0"/>
-      </w:pPr>
-      <w:r>
-        <w:rPr>
-          <w:rFonts w:ascii="Calibri" w:hAnsi="Calibri" w:eastAsia="Calibri"/>
-          <w:b w:val="0"/>
-          <w:color w:val="555555"/>
-          <w:sz w:val="18"/>
-        </w:rPr>
-        <w:t>Respaldo: 12-03-2026 AEB</w:t>
-      </w:r>
-    </w:p>
-    <w:p>
-      <w:pPr>
-        <w:spacing w:after="40" w:before="0"/>
-      </w:pPr>
-      <w:r>
-        <w:rPr>
-          <w:rFonts w:ascii="Calibri" w:hAnsi="Calibri" w:eastAsia="Calibri"/>
-          <w:b/>
-          <w:color w:val="1F4E79"/>
-          <w:sz w:val="24"/>
-        </w:rPr>
-        <w:t>13-03-2026  —  Arauco El Bosque</w:t>
-      </w:r>
-    </w:p>
-    <w:p>
-      <w:pPr>
-        <w:spacing w:after="40" w:before="0"/>
-      </w:pPr>
-      <w:r>
-        <w:rPr>
-          <w:rFonts w:ascii="Calibri" w:hAnsi="Calibri" w:eastAsia="Calibri"/>
-          <w:b w:val="0"/>
-          <w:color w:val="444444"/>
-          <w:sz w:val="20"/>
-        </w:rPr>
-        <w:t>Técnico: No indicado en el registro.</w:t>
-      </w:r>
-    </w:p>
-    <w:p>
-      <w:pPr>
-        <w:spacing w:after="20" w:before="0"/>
-      </w:pPr>
-      <w:r>
-        <w:rPr>
-          <w:rFonts w:ascii="Calibri" w:hAnsi="Calibri" w:eastAsia="Calibri"/>
-          <w:b/>
-          <w:sz w:val="22"/>
-        </w:rPr>
-        <w:t>Acta de visita — Acta en Drive</w:t>
-      </w:r>
-    </w:p>
-    <w:p>
-      <w:pPr>
-        <w:spacing w:after="20" w:before="0"/>
-      </w:pPr>
-      <w:r>
-        <w:rPr>
-          <w:rFonts w:ascii="Calibri" w:hAnsi="Calibri" w:eastAsia="Calibri"/>
-          <w:b w:val="0"/>
-          <w:sz w:val="22"/>
-        </w:rPr>
-        <w:t>Respaldo fotográfico / acta en Drive (sin fila en el Registro de fallas).</w:t>
-      </w:r>
-    </w:p>
-    <w:p>
-      <w:pPr>
-        <w:spacing w:after="80" w:before="0"/>
-      </w:pPr>
-      <w:r>
-        <w:rPr>
-          <w:rFonts w:ascii="Calibri" w:hAnsi="Calibri" w:eastAsia="Calibri"/>
-          <w:b w:val="0"/>
-          <w:color w:val="555555"/>
-          <w:sz w:val="18"/>
-        </w:rPr>
-        <w:t>Respaldo: 13-03-2026 AEB</w:t>
+        <w:t>Cambio de un tramo de tubería PPR (PU 10).</w:t>
       </w:r>
     </w:p>
     <w:p>
@@ -2329,7 +1255,7 @@
           <w:color w:val="444444"/>
           <w:sz w:val="20"/>
         </w:rPr>
-        <w:t>Técnico: No indicado en el registro.</w:t>
+        <w:t>Técnico: No identificado en el acta (recibe Joceline Lazo).</w:t>
       </w:r>
     </w:p>
     <w:p>
@@ -2342,12 +1268,12 @@
           <w:b/>
           <w:sz w:val="22"/>
         </w:rPr>
-        <w:t>Acta de visita — Acta en Drive</w:t>
+        <w:t>Impulsión</w:t>
       </w:r>
     </w:p>
     <w:p>
       <w:pPr>
-        <w:spacing w:after="20" w:before="0"/>
+        <w:spacing w:after="60" w:before="0"/>
       </w:pPr>
       <w:r>
         <w:rPr>
@@ -2355,21 +1281,33 @@
           <w:b w:val="0"/>
           <w:sz w:val="22"/>
         </w:rPr>
-        <w:t>Respaldo fotográfico / acta en Drive (sin fila en el Registro de fallas).</w:t>
+        <w:t>Caudalímetro desconfigurado por ruido eléctrico. Se reprograma y se guarda. El equipo queda operativo.</w:t>
       </w:r>
     </w:p>
     <w:p>
       <w:pPr>
-        <w:spacing w:after="80" w:before="0"/>
+        <w:spacing w:after="20" w:before="0"/>
+      </w:pPr>
+      <w:r>
+        <w:rPr>
+          <w:rFonts w:ascii="Calibri" w:hAnsi="Calibri" w:eastAsia="Calibri"/>
+          <w:b/>
+          <w:sz w:val="22"/>
+        </w:rPr>
+        <w:t>Baño</w:t>
+      </w:r>
+    </w:p>
+    <w:p>
+      <w:pPr>
+        <w:spacing w:after="60" w:before="0"/>
       </w:pPr>
       <w:r>
         <w:rPr>
           <w:rFonts w:ascii="Calibri" w:hAnsi="Calibri" w:eastAsia="Calibri"/>
           <w:b w:val="0"/>
-          <w:color w:val="555555"/>
-          <w:sz w:val="18"/>
+          <w:sz w:val="22"/>
         </w:rPr>
-        <w:t>Respaldo: 19-03-2026 Cur</w:t>
+        <w:t>Error de configuración del caudalímetro. Se corrige el diámetro.</w:t>
       </w:r>
     </w:p>
     <w:p>
@@ -2397,7 +1335,7 @@
           <w:color w:val="444444"/>
           <w:sz w:val="20"/>
         </w:rPr>
-        <w:t>Técnico: No indicado en el registro.</w:t>
+        <w:t>Técnico: No identificado en el acta (recibe Alberto, jefe de mantención).</w:t>
       </w:r>
     </w:p>
     <w:p>
@@ -2410,12 +1348,12 @@
           <w:b/>
           <w:sz w:val="22"/>
         </w:rPr>
-        <w:t>Acta de visita — Acta en Drive</w:t>
+        <w:t>San Ignacio 500</w:t>
       </w:r>
     </w:p>
     <w:p>
       <w:pPr>
-        <w:spacing w:after="20" w:before="0"/>
+        <w:spacing w:after="60" w:before="0"/>
       </w:pPr>
       <w:r>
         <w:rPr>
@@ -2423,21 +1361,7 @@
           <w:b w:val="0"/>
           <w:sz w:val="22"/>
         </w:rPr>
-        <w:t>Respaldo fotográfico / acta en Drive (sin fila en el Registro de fallas).</w:t>
-      </w:r>
-    </w:p>
-    <w:p>
-      <w:pPr>
-        <w:spacing w:after="80" w:before="0"/>
-      </w:pPr>
-      <w:r>
-        <w:rPr>
-          <w:rFonts w:ascii="Calibri" w:hAnsi="Calibri" w:eastAsia="Calibri"/>
-          <w:b w:val="0"/>
-          <w:color w:val="555555"/>
-          <w:sz w:val="18"/>
-        </w:rPr>
-        <w:t>Respaldo: 31-03-2026 Bom</w:t>
+        <w:t>MAX 232 quemada. El equipo queda no operativo. San Ignacio 300 se revisó y estaba bien.</w:t>
       </w:r>
     </w:p>
     <w:p>
@@ -2479,7 +1403,7 @@
           <w:color w:val="444444"/>
           <w:sz w:val="20"/>
         </w:rPr>
-        <w:t>Técnico: No indicado en el registro.</w:t>
+        <w:t>Técnico: No identificado en el acta (recibe Constanza Vilches).</w:t>
       </w:r>
     </w:p>
     <w:p>
@@ -2492,12 +1416,12 @@
           <w:b/>
           <w:sz w:val="22"/>
         </w:rPr>
-        <w:t>Falabella — Acta en Drive</w:t>
+        <w:t>Sala de bombas Falabella</w:t>
       </w:r>
     </w:p>
     <w:p>
       <w:pPr>
-        <w:spacing w:after="20" w:before="0"/>
+        <w:spacing w:after="60" w:before="0"/>
       </w:pPr>
       <w:r>
         <w:rPr>
@@ -2505,89 +1429,7 @@
           <w:b w:val="0"/>
           <w:sz w:val="22"/>
         </w:rPr>
-        <w:t>Respaldo en Drive (sin fila en el Registro de fallas).</w:t>
-      </w:r>
-    </w:p>
-    <w:p>
-      <w:pPr>
-        <w:spacing w:after="80" w:before="0"/>
-      </w:pPr>
-      <w:r>
-        <w:rPr>
-          <w:rFonts w:ascii="Calibri" w:hAnsi="Calibri" w:eastAsia="Calibri"/>
-          <w:b w:val="0"/>
-          <w:color w:val="555555"/>
-          <w:sz w:val="18"/>
-        </w:rPr>
-        <w:t>Respaldo: PA MAM Falabella 02–04-26</w:t>
-      </w:r>
-    </w:p>
-    <w:p>
-      <w:pPr>
-        <w:spacing w:after="40" w:before="0"/>
-      </w:pPr>
-      <w:r>
-        <w:rPr>
-          <w:rFonts w:ascii="Calibri" w:hAnsi="Calibri" w:eastAsia="Calibri"/>
-          <w:b/>
-          <w:color w:val="1F4E79"/>
-          <w:sz w:val="24"/>
-        </w:rPr>
-        <w:t>29-04-2026  —  Arauco Curauma</w:t>
-      </w:r>
-    </w:p>
-    <w:p>
-      <w:pPr>
-        <w:spacing w:after="40" w:before="0"/>
-      </w:pPr>
-      <w:r>
-        <w:rPr>
-          <w:rFonts w:ascii="Calibri" w:hAnsi="Calibri" w:eastAsia="Calibri"/>
-          <w:b w:val="0"/>
-          <w:color w:val="444444"/>
-          <w:sz w:val="20"/>
-        </w:rPr>
-        <w:t>Técnico: No indicado en el registro.</w:t>
-      </w:r>
-    </w:p>
-    <w:p>
-      <w:pPr>
-        <w:spacing w:after="20" w:before="0"/>
-      </w:pPr>
-      <w:r>
-        <w:rPr>
-          <w:rFonts w:ascii="Calibri" w:hAnsi="Calibri" w:eastAsia="Calibri"/>
-          <w:b/>
-          <w:sz w:val="22"/>
-        </w:rPr>
-        <w:t>Acta de visita — Acta en Drive</w:t>
-      </w:r>
-    </w:p>
-    <w:p>
-      <w:pPr>
-        <w:spacing w:after="20" w:before="0"/>
-      </w:pPr>
-      <w:r>
-        <w:rPr>
-          <w:rFonts w:ascii="Calibri" w:hAnsi="Calibri" w:eastAsia="Calibri"/>
-          <w:b w:val="0"/>
-          <w:sz w:val="22"/>
-        </w:rPr>
-        <w:t>Respaldo fotográfico / acta en Drive (sin fila en el Registro de fallas).</w:t>
-      </w:r>
-    </w:p>
-    <w:p>
-      <w:pPr>
-        <w:spacing w:after="80" w:before="0"/>
-      </w:pPr>
-      <w:r>
-        <w:rPr>
-          <w:rFonts w:ascii="Calibri" w:hAnsi="Calibri" w:eastAsia="Calibri"/>
-          <w:b w:val="0"/>
-          <w:color w:val="555555"/>
-          <w:sz w:val="18"/>
-        </w:rPr>
-        <w:t>Respaldo: Cur 29-04-26</w:t>
+        <w:t>Inundación. Quedan dañados la placa WES, el medidor ultrasónico y la fuente de alimentación. El cambio queda coordinado para cuando la sala tenga energía.</w:t>
       </w:r>
     </w:p>
     <w:p>
@@ -2629,7 +1471,7 @@
           <w:color w:val="444444"/>
           <w:sz w:val="20"/>
         </w:rPr>
-        <w:t>Técnico: No indicado en el registro.</w:t>
+        <w:t>Técnico: No identificado en el acta (recibe Joceline Lazo).</w:t>
       </w:r>
     </w:p>
     <w:p>
@@ -2642,12 +1484,12 @@
           <w:b/>
           <w:sz w:val="22"/>
         </w:rPr>
-        <w:t>Acta de visita — Acta en Drive</w:t>
+        <w:t>Sensor ultrasónico</w:t>
       </w:r>
     </w:p>
     <w:p>
       <w:pPr>
-        <w:spacing w:after="20" w:before="0"/>
+        <w:spacing w:after="60" w:before="0"/>
       </w:pPr>
       <w:r>
         <w:rPr>
@@ -2655,89 +1497,7 @@
           <w:b w:val="0"/>
           <w:sz w:val="22"/>
         </w:rPr>
-        <w:t>Respaldo fotográfico / acta en Drive (sin fila en el Registro de fallas).</w:t>
-      </w:r>
-    </w:p>
-    <w:p>
-      <w:pPr>
-        <w:spacing w:after="80" w:before="0"/>
-      </w:pPr>
-      <w:r>
-        <w:rPr>
-          <w:rFonts w:ascii="Calibri" w:hAnsi="Calibri" w:eastAsia="Calibri"/>
-          <w:b w:val="0"/>
-          <w:color w:val="555555"/>
-          <w:sz w:val="18"/>
-        </w:rPr>
-        <w:t>Respaldo: 11-05-2026 Cur</w:t>
-      </w:r>
-    </w:p>
-    <w:p>
-      <w:pPr>
-        <w:spacing w:after="40" w:before="0"/>
-      </w:pPr>
-      <w:r>
-        <w:rPr>
-          <w:rFonts w:ascii="Calibri" w:hAnsi="Calibri" w:eastAsia="Calibri"/>
-          <w:b/>
-          <w:color w:val="1F4E79"/>
-          <w:sz w:val="24"/>
-        </w:rPr>
-        <w:t>15-05-2026  —  Arauco El Bosque</w:t>
-      </w:r>
-    </w:p>
-    <w:p>
-      <w:pPr>
-        <w:spacing w:after="40" w:before="0"/>
-      </w:pPr>
-      <w:r>
-        <w:rPr>
-          <w:rFonts w:ascii="Calibri" w:hAnsi="Calibri" w:eastAsia="Calibri"/>
-          <w:b w:val="0"/>
-          <w:color w:val="444444"/>
-          <w:sz w:val="20"/>
-        </w:rPr>
-        <w:t>Técnico: No indicado en el registro.</w:t>
-      </w:r>
-    </w:p>
-    <w:p>
-      <w:pPr>
-        <w:spacing w:after="20" w:before="0"/>
-      </w:pPr>
-      <w:r>
-        <w:rPr>
-          <w:rFonts w:ascii="Calibri" w:hAnsi="Calibri" w:eastAsia="Calibri"/>
-          <w:b/>
-          <w:sz w:val="22"/>
-        </w:rPr>
-        <w:t>Acta de visita — Acta en Drive</w:t>
-      </w:r>
-    </w:p>
-    <w:p>
-      <w:pPr>
-        <w:spacing w:after="20" w:before="0"/>
-      </w:pPr>
-      <w:r>
-        <w:rPr>
-          <w:rFonts w:ascii="Calibri" w:hAnsi="Calibri" w:eastAsia="Calibri"/>
-          <w:b w:val="0"/>
-          <w:sz w:val="22"/>
-        </w:rPr>
-        <w:t>Respaldo fotográfico / acta en Drive (sin fila en el Registro de fallas).</w:t>
-      </w:r>
-    </w:p>
-    <w:p>
-      <w:pPr>
-        <w:spacing w:after="80" w:before="0"/>
-      </w:pPr>
-      <w:r>
-        <w:rPr>
-          <w:rFonts w:ascii="Calibri" w:hAnsi="Calibri" w:eastAsia="Calibri"/>
-          <w:b w:val="0"/>
-          <w:color w:val="555555"/>
-          <w:sz w:val="18"/>
-        </w:rPr>
-        <w:t>Respaldo: 15-05-2026 parque Arauco el bosque</w:t>
+        <w:t>Memoria interna llena. Se cambia el equipo y se normaliza.</w:t>
       </w:r>
     </w:p>
     <w:p>
@@ -2778,12 +1538,12 @@
           <w:b/>
           <w:sz w:val="22"/>
         </w:rPr>
-        <w:t>ESTANQUE NORTE LOCALES — Mtto Correctivo — Ultrasonido — Desconfiguracion</w:t>
+        <w:t>Estanque norte</w:t>
       </w:r>
     </w:p>
     <w:p>
       <w:pPr>
-        <w:spacing w:after="20" w:before="0"/>
+        <w:spacing w:after="60" w:before="0"/>
       </w:pPr>
       <w:r>
         <w:rPr>
@@ -2791,103 +1551,7 @@
           <w:b w:val="0"/>
           <w:sz w:val="22"/>
         </w:rPr>
-        <w:t>revicion de caudalimetro, este se cetea en "cero" para su buena lectura</w:t>
-      </w:r>
-    </w:p>
-    <w:p>
-      <w:pPr>
-        <w:spacing w:after="40" w:before="0"/>
-      </w:pPr>
-      <w:r>
-        <w:rPr>
-          <w:rFonts w:ascii="Calibri" w:hAnsi="Calibri" w:eastAsia="Calibri"/>
-          <w:b w:val="0"/>
-          <w:color w:val="555555"/>
-          <w:sz w:val="18"/>
-        </w:rPr>
-        <w:t>Respaldo: fila del Registro de fallas.</w:t>
-      </w:r>
-    </w:p>
-    <w:p>
-      <w:pPr>
-        <w:spacing w:after="120" w:before="0"/>
-      </w:pPr>
-      <w:r>
-        <w:rPr>
-          <w:rFonts w:ascii="Calibri" w:hAnsi="Calibri" w:eastAsia="Calibri"/>
-          <w:b w:val="0"/>
-          <w:color w:val="555555"/>
-          <w:sz w:val="18"/>
-        </w:rPr>
-        <w:t>Acta del día: 15-05-2026 Mae</w:t>
-      </w:r>
-    </w:p>
-    <w:p>
-      <w:pPr>
-        <w:spacing w:after="40" w:before="0"/>
-      </w:pPr>
-      <w:r>
-        <w:rPr>
-          <w:rFonts w:ascii="Calibri" w:hAnsi="Calibri" w:eastAsia="Calibri"/>
-          <w:b/>
-          <w:color w:val="1F4E79"/>
-          <w:sz w:val="24"/>
-        </w:rPr>
-        <w:t>18-05-2026  —  Arauco El Bosque</w:t>
-      </w:r>
-    </w:p>
-    <w:p>
-      <w:pPr>
-        <w:spacing w:after="40" w:before="0"/>
-      </w:pPr>
-      <w:r>
-        <w:rPr>
-          <w:rFonts w:ascii="Calibri" w:hAnsi="Calibri" w:eastAsia="Calibri"/>
-          <w:b w:val="0"/>
-          <w:color w:val="444444"/>
-          <w:sz w:val="20"/>
-        </w:rPr>
-        <w:t>Técnico: No indicado en el registro.</w:t>
-      </w:r>
-    </w:p>
-    <w:p>
-      <w:pPr>
-        <w:spacing w:after="20" w:before="0"/>
-      </w:pPr>
-      <w:r>
-        <w:rPr>
-          <w:rFonts w:ascii="Calibri" w:hAnsi="Calibri" w:eastAsia="Calibri"/>
-          <w:b/>
-          <w:sz w:val="22"/>
-        </w:rPr>
-        <w:t>Acta de visita — Acta en Drive</w:t>
-      </w:r>
-    </w:p>
-    <w:p>
-      <w:pPr>
-        <w:spacing w:after="20" w:before="0"/>
-      </w:pPr>
-      <w:r>
-        <w:rPr>
-          <w:rFonts w:ascii="Calibri" w:hAnsi="Calibri" w:eastAsia="Calibri"/>
-          <w:b w:val="0"/>
-          <w:sz w:val="22"/>
-        </w:rPr>
-        <w:t>Respaldo fotográfico / acta en Drive (sin fila en el Registro de fallas).</w:t>
-      </w:r>
-    </w:p>
-    <w:p>
-      <w:pPr>
-        <w:spacing w:after="80" w:before="0"/>
-      </w:pPr>
-      <w:r>
-        <w:rPr>
-          <w:rFonts w:ascii="Calibri" w:hAnsi="Calibri" w:eastAsia="Calibri"/>
-          <w:b w:val="0"/>
-          <w:color w:val="555555"/>
-          <w:sz w:val="18"/>
-        </w:rPr>
-        <w:t>Respaldo: 18-05-2026 AEB</w:t>
+        <w:t>Caudalímetro desconfigurado. Se setea en cero y queda operativo.</w:t>
       </w:r>
     </w:p>
     <w:p>
@@ -2915,7 +1579,7 @@
           <w:color w:val="444444"/>
           <w:sz w:val="20"/>
         </w:rPr>
-        <w:t>Técnico: No indicado en el registro.</w:t>
+        <w:t>Técnico: No identificado en el acta (recibe Joceline Lazo).</w:t>
       </w:r>
     </w:p>
     <w:p>
@@ -2928,12 +1592,12 @@
           <w:b/>
           <w:sz w:val="22"/>
         </w:rPr>
-        <w:t>Acta de visita — Acta en Drive</w:t>
+        <w:t>Equipo de monitoreo</w:t>
       </w:r>
     </w:p>
     <w:p>
       <w:pPr>
-        <w:spacing w:after="20" w:before="0"/>
+        <w:spacing w:after="60" w:before="0"/>
       </w:pPr>
       <w:r>
         <w:rPr>
@@ -2941,21 +1605,7 @@
           <w:b w:val="0"/>
           <w:sz w:val="22"/>
         </w:rPr>
-        <w:t>Respaldo fotográfico / acta en Drive (sin fila en el Registro de fallas).</w:t>
-      </w:r>
-    </w:p>
-    <w:p>
-      <w:pPr>
-        <w:spacing w:after="80" w:before="0"/>
-      </w:pPr>
-      <w:r>
-        <w:rPr>
-          <w:rFonts w:ascii="Calibri" w:hAnsi="Calibri" w:eastAsia="Calibri"/>
-          <w:b w:val="0"/>
-          <w:color w:val="555555"/>
-          <w:sz w:val="18"/>
-        </w:rPr>
-        <w:t>Respaldo: 19-05-2026 Cur</w:t>
+        <w:t>Problema de conexión y memoria defectuosa. Se reemplaza la placa. El equipo queda operativo.</w:t>
       </w:r>
     </w:p>
     <w:p>
@@ -2983,7 +1633,7 @@
           <w:color w:val="444444"/>
           <w:sz w:val="20"/>
         </w:rPr>
-        <w:t>Técnico: No indicado en el registro.</w:t>
+        <w:t>Técnico: No identificado en el acta.</w:t>
       </w:r>
     </w:p>
     <w:p>
@@ -2996,12 +1646,12 @@
           <w:b/>
           <w:sz w:val="22"/>
         </w:rPr>
-        <w:t>Acta de visita — Acta en Drive</w:t>
+        <w:t>Punto de monitoreo</w:t>
       </w:r>
     </w:p>
     <w:p>
       <w:pPr>
-        <w:spacing w:after="20" w:before="0"/>
+        <w:spacing w:after="60" w:before="0"/>
       </w:pPr>
       <w:r>
         <w:rPr>
@@ -3009,7 +1659,7 @@
           <w:b w:val="0"/>
           <w:sz w:val="22"/>
         </w:rPr>
-        <w:t>Respaldo fotográfico / acta en Drive (sin fila en el Registro de fallas).</w:t>
+        <w:t>No marcaba consumo por posible intervención de terceros. Se reprograma y queda operativo.</w:t>
       </w:r>
     </w:p>
     <w:p>
@@ -3019,11 +1669,11 @@
       <w:r>
         <w:rPr>
           <w:rFonts w:ascii="Calibri" w:hAnsi="Calibri" w:eastAsia="Calibri"/>
-          <w:b w:val="0"/>
-          <w:color w:val="555555"/>
-          <w:sz w:val="18"/>
+          <w:b/>
+          <w:color w:val="2E7AC8"/>
+          <w:sz w:val="26"/>
         </w:rPr>
-        <w:t>Respaldo: 20-05-2026 PaK</w:t>
+        <w:t>Jun 2026</w:t>
       </w:r>
     </w:p>
     <w:p>
@@ -3037,7 +1687,7 @@
           <w:color w:val="1F4E79"/>
           <w:sz w:val="24"/>
         </w:rPr>
-        <w:t>29-05-2026  —  Arauco Estación</w:t>
+        <w:t>23-06-2026  —  Arauco Estación</w:t>
       </w:r>
     </w:p>
     <w:p>
@@ -3064,12 +1714,12 @@
           <w:b/>
           <w:sz w:val="22"/>
         </w:rPr>
-        <w:t>ESTANQUE NORTE LOCALES — Hídrica</w:t>
+        <w:t>Estanque sur — válvula de control</w:t>
       </w:r>
     </w:p>
     <w:p>
       <w:pPr>
-        <w:spacing w:after="20" w:before="0"/>
+        <w:spacing w:after="60" w:before="0"/>
       </w:pPr>
       <w:r>
         <w:rPr>
@@ -3077,12 +1727,106 @@
           <w:b w:val="0"/>
           <w:sz w:val="22"/>
         </w:rPr>
-        <w:t>intervencion hisdrica, instalacion de valvulas se control + llave mariposa</w:t>
+        <w:t>Reparación de filtración en la válvula de control, sala de bombas.</w:t>
       </w:r>
     </w:p>
     <w:p>
       <w:pPr>
+        <w:spacing w:after="20" w:before="0"/>
+      </w:pPr>
+      <w:r>
+        <w:rPr>
+          <w:rFonts w:ascii="Calibri" w:hAnsi="Calibri" w:eastAsia="Calibri"/>
+          <w:b/>
+          <w:sz w:val="22"/>
+        </w:rPr>
+        <w:t>Estanque sur y norte</w:t>
+      </w:r>
+    </w:p>
+    <w:p>
+      <w:pPr>
+        <w:spacing w:after="60" w:before="0"/>
+      </w:pPr>
+      <w:r>
+        <w:rPr>
+          <w:rFonts w:ascii="Calibri" w:hAnsi="Calibri" w:eastAsia="Calibri"/>
+          <w:b w:val="0"/>
+          <w:sz w:val="22"/>
+        </w:rPr>
+        <w:t>Calentón en el despiche del solenoide.</w:t>
+      </w:r>
+    </w:p>
+    <w:p>
+      <w:pPr>
         <w:spacing w:after="80" w:before="0"/>
+      </w:pPr>
+      <w:r>
+        <w:rPr>
+          <w:rFonts w:ascii="Calibri" w:hAnsi="Calibri" w:eastAsia="Calibri"/>
+          <w:b/>
+          <w:color w:val="2E7AC8"/>
+          <w:sz w:val="26"/>
+        </w:rPr>
+        <w:t>Jul 2026</w:t>
+      </w:r>
+    </w:p>
+    <w:p>
+      <w:pPr>
+        <w:spacing w:after="40" w:before="0"/>
+      </w:pPr>
+      <w:r>
+        <w:rPr>
+          <w:rFonts w:ascii="Calibri" w:hAnsi="Calibri" w:eastAsia="Calibri"/>
+          <w:b/>
+          <w:color w:val="1F4E79"/>
+          <w:sz w:val="24"/>
+        </w:rPr>
+        <w:t>15-07-2026  —  Arauco Buenaventura</w:t>
+      </w:r>
+    </w:p>
+    <w:p>
+      <w:pPr>
+        <w:spacing w:after="40" w:before="0"/>
+      </w:pPr>
+      <w:r>
+        <w:rPr>
+          <w:rFonts w:ascii="Calibri" w:hAnsi="Calibri" w:eastAsia="Calibri"/>
+          <w:b w:val="0"/>
+          <w:color w:val="444444"/>
+          <w:sz w:val="20"/>
+        </w:rPr>
+        <w:t>Técnico: No identificado en el acta.</w:t>
+      </w:r>
+    </w:p>
+    <w:p>
+      <w:pPr>
+        <w:spacing w:after="20" w:before="0"/>
+      </w:pPr>
+      <w:r>
+        <w:rPr>
+          <w:rFonts w:ascii="Calibri" w:hAnsi="Calibri" w:eastAsia="Calibri"/>
+          <w:b/>
+          <w:sz w:val="22"/>
+        </w:rPr>
+        <w:t>San Ignacio 500</w:t>
+      </w:r>
+    </w:p>
+    <w:p>
+      <w:pPr>
+        <w:spacing w:after="60" w:before="0"/>
+      </w:pPr>
+      <w:r>
+        <w:rPr>
+          <w:rFonts w:ascii="Calibri" w:hAnsi="Calibri" w:eastAsia="Calibri"/>
+          <w:b w:val="0"/>
+          <w:sz w:val="22"/>
+        </w:rPr>
+        <w:t>Cambio de solenoide en la válvula de control. Prueba de corte correcta.</w:t>
+      </w:r>
+    </w:p>
+    <w:p>
+      <w:pPr>
+        <w:spacing w:after="120" w:before="0"/>
       </w:pPr>
       <w:r>
         <w:rPr>
@@ -3091,21 +1835,7 @@
           <w:color w:val="555555"/>
           <w:sz w:val="18"/>
         </w:rPr>
-        <w:t>Respaldo: 29-05-26 Control Estanque Norte</w:t>
-      </w:r>
-    </w:p>
-    <w:p>
-      <w:pPr>
-        <w:spacing w:after="120" w:before="0"/>
-      </w:pPr>
-      <w:r>
-        <w:rPr>
-          <w:rFonts w:ascii="Calibri" w:hAnsi="Calibri" w:eastAsia="Calibri"/>
-          <w:b w:val="0"/>
-          <w:color w:val="555555"/>
-          <w:sz w:val="18"/>
-        </w:rPr>
-        <w:t>Acta del día: 29-05-2026 mae</w:t>
+        <w:t>El PDF está archivado en la carpeta de Quilicura. El punto anotado es San Ignacio 500.</w:t>
       </w:r>
     </w:p>
     <w:p>
@@ -3119,7 +1849,7 @@
           <w:color w:val="2E7AC8"/>
           <w:sz w:val="26"/>
         </w:rPr>
-        <w:t>Jun 2026</w:t>
+        <w:t>Ago 2026</w:t>
       </w:r>
     </w:p>
     <w:p>
@@ -3133,7 +1863,7 @@
           <w:color w:val="1F4E79"/>
           <w:sz w:val="24"/>
         </w:rPr>
-        <w:t>05-06-2026  —  Arauco Estación</w:t>
+        <w:t>13-08-2026  —  Arauco Estación</w:t>
       </w:r>
     </w:p>
     <w:p>
@@ -3147,7 +1877,7 @@
           <w:color w:val="444444"/>
           <w:sz w:val="20"/>
         </w:rPr>
-        <w:t>Técnico: No indicado en el registro.</w:t>
+        <w:t>Técnico: Aníbal Aranda.</w:t>
       </w:r>
     </w:p>
     <w:p>
@@ -3160,12 +1890,12 @@
           <w:b/>
           <w:sz w:val="22"/>
         </w:rPr>
-        <w:t>Estanque norte y sur — Acta en Drive</w:t>
+        <w:t>Estanque norte locales</w:t>
       </w:r>
     </w:p>
     <w:p>
       <w:pPr>
-        <w:spacing w:after="20" w:before="0"/>
+        <w:spacing w:after="60" w:before="0"/>
       </w:pPr>
       <w:r>
         <w:rPr>
@@ -3173,21 +1903,73 @@
           <w:b w:val="0"/>
           <w:sz w:val="22"/>
         </w:rPr>
-        <w:t>Respaldo en Drive (sin fila en el Registro de fallas).</w:t>
+        <w:t>Cambio de solenoide de NC a NO. Folios 2257 y 2258. Horario de corte 00:00 a 06:00.</w:t>
       </w:r>
     </w:p>
     <w:p>
       <w:pPr>
-        <w:spacing w:after="80" w:before="0"/>
+        <w:spacing w:after="20" w:before="0"/>
+      </w:pPr>
+      <w:r>
+        <w:rPr>
+          <w:rFonts w:ascii="Calibri" w:hAnsi="Calibri" w:eastAsia="Calibri"/>
+          <w:b/>
+          <w:sz w:val="22"/>
+        </w:rPr>
+        <w:t>Pizza Hut</w:t>
+      </w:r>
+    </w:p>
+    <w:p>
+      <w:pPr>
+        <w:spacing w:after="60" w:before="0"/>
       </w:pPr>
       <w:r>
         <w:rPr>
           <w:rFonts w:ascii="Calibri" w:hAnsi="Calibri" w:eastAsia="Calibri"/>
           <w:b w:val="0"/>
-          <w:color w:val="555555"/>
-          <w:sz w:val="18"/>
+          <w:sz w:val="22"/>
         </w:rPr>
-        <w:t>Respaldo: 05-06-26 Estanque norte y sur</w:t>
+        <w:t>Cambio de solenoide de NC a NO. Folio 2259.</w:t>
+      </w:r>
+    </w:p>
+    <w:p>
+      <w:pPr>
+        <w:spacing w:after="20" w:before="0"/>
+      </w:pPr>
+      <w:r>
+        <w:rPr>
+          <w:rFonts w:ascii="Calibri" w:hAnsi="Calibri" w:eastAsia="Calibri"/>
+          <w:b/>
+          <w:sz w:val="22"/>
+        </w:rPr>
+        <w:t>Sala de bombas estanque sur</w:t>
+      </w:r>
+    </w:p>
+    <w:p>
+      <w:pPr>
+        <w:spacing w:after="60" w:before="0"/>
+      </w:pPr>
+      <w:r>
+        <w:rPr>
+          <w:rFonts w:ascii="Calibri" w:hAnsi="Calibri" w:eastAsia="Calibri"/>
+          <w:b w:val="0"/>
+          <w:sz w:val="22"/>
+        </w:rPr>
+        <w:t>Cambio de solenoide de NC a NO. Folio 2260.</w:t>
+      </w:r>
+    </w:p>
+    <w:p>
+      <w:pPr>
+        <w:spacing w:after="80" w:before="0"/>
+      </w:pPr>
+      <w:r>
+        <w:rPr>
+          <w:rFonts w:ascii="Calibri" w:hAnsi="Calibri" w:eastAsia="Calibri"/>
+          <w:b/>
+          <w:color w:val="2E7AC8"/>
+          <w:sz w:val="26"/>
+        </w:rPr>
+        <w:t>Sep 2026</w:t>
       </w:r>
     </w:p>
     <w:p>
@@ -3201,7 +1983,7 @@
           <w:color w:val="1F4E79"/>
           <w:sz w:val="24"/>
         </w:rPr>
-        <w:t>23-06-2026  —  Arauco Estación</w:t>
+        <w:t>14-09-2026  —  Arauco Estación</w:t>
       </w:r>
     </w:p>
     <w:p>
@@ -3228,12 +2010,12 @@
           <w:b/>
           <w:sz w:val="22"/>
         </w:rPr>
-        <w:t>ESTANQUE CARGA ESTANQUE SUR — Mtto Correctivo — Hídrica — Membrana</w:t>
+        <w:t>Estanque norte locales</w:t>
       </w:r>
     </w:p>
     <w:p>
       <w:pPr>
-        <w:spacing w:after="20" w:before="0"/>
+        <w:spacing w:after="60" w:before="0"/>
       </w:pPr>
       <w:r>
         <w:rPr>
@@ -3241,49 +2023,7 @@
           <w:b w:val="0"/>
           <w:sz w:val="22"/>
         </w:rPr>
-        <w:t>reparacion de filtracion en valvula de control</w:t>
-      </w:r>
-    </w:p>
-    <w:p>
-      <w:pPr>
-        <w:spacing w:after="40" w:before="0"/>
-      </w:pPr>
-      <w:r>
-        <w:rPr>
-          <w:rFonts w:ascii="Calibri" w:hAnsi="Calibri" w:eastAsia="Calibri"/>
-          <w:b w:val="0"/>
-          <w:color w:val="555555"/>
-          <w:sz w:val="18"/>
-        </w:rPr>
-        <w:t>Respaldo: fila del Registro de fallas.</w:t>
-      </w:r>
-    </w:p>
-    <w:p>
-      <w:pPr>
-        <w:spacing w:after="120" w:before="0"/>
-      </w:pPr>
-      <w:r>
-        <w:rPr>
-          <w:rFonts w:ascii="Calibri" w:hAnsi="Calibri" w:eastAsia="Calibri"/>
-          <w:b w:val="0"/>
-          <w:color w:val="555555"/>
-          <w:sz w:val="18"/>
-        </w:rPr>
-        <w:t>Acta del día: 23-06-2026 Estación central</w:t>
-      </w:r>
-    </w:p>
-    <w:p>
-      <w:pPr>
-        <w:spacing w:after="80" w:before="0"/>
-      </w:pPr>
-      <w:r>
-        <w:rPr>
-          <w:rFonts w:ascii="Calibri" w:hAnsi="Calibri" w:eastAsia="Calibri"/>
-          <w:b/>
-          <w:color w:val="2E7AC8"/>
-          <w:sz w:val="26"/>
-        </w:rPr>
-        <w:t>Jul 2026</w:t>
+        <w:t>MAX 232 con falla. Se reemplaza. La señal en la sala de bombas -2 queda débil.</w:t>
       </w:r>
     </w:p>
     <w:p>
@@ -3297,359 +2037,7 @@
           <w:color w:val="1F4E79"/>
           <w:sz w:val="24"/>
         </w:rPr>
-        <w:t>15-07-2026  —  Arauco Quilicura</w:t>
-      </w:r>
-    </w:p>
-    <w:p>
-      <w:pPr>
-        <w:spacing w:after="40" w:before="0"/>
-      </w:pPr>
-      <w:r>
-        <w:rPr>
-          <w:rFonts w:ascii="Calibri" w:hAnsi="Calibri" w:eastAsia="Calibri"/>
-          <w:b w:val="0"/>
-          <w:color w:val="444444"/>
-          <w:sz w:val="20"/>
-        </w:rPr>
-        <w:t>Técnico: No indicado en el registro.</w:t>
-      </w:r>
-    </w:p>
-    <w:p>
-      <w:pPr>
-        <w:spacing w:after="20" w:before="0"/>
-      </w:pPr>
-      <w:r>
-        <w:rPr>
-          <w:rFonts w:ascii="Calibri" w:hAnsi="Calibri" w:eastAsia="Calibri"/>
-          <w:b/>
-          <w:sz w:val="22"/>
-        </w:rPr>
-        <w:t>Acta de visita — Acta en Drive</w:t>
-      </w:r>
-    </w:p>
-    <w:p>
-      <w:pPr>
-        <w:spacing w:after="20" w:before="0"/>
-      </w:pPr>
-      <w:r>
-        <w:rPr>
-          <w:rFonts w:ascii="Calibri" w:hAnsi="Calibri" w:eastAsia="Calibri"/>
-          <w:b w:val="0"/>
-          <w:sz w:val="22"/>
-        </w:rPr>
-        <w:t>Respaldo fotográfico / acta en Drive (sin fila en el Registro de fallas).</w:t>
-      </w:r>
-    </w:p>
-    <w:p>
-      <w:pPr>
-        <w:spacing w:after="80" w:before="0"/>
-      </w:pPr>
-      <w:r>
-        <w:rPr>
-          <w:rFonts w:ascii="Calibri" w:hAnsi="Calibri" w:eastAsia="Calibri"/>
-          <w:b w:val="0"/>
-          <w:color w:val="555555"/>
-          <w:sz w:val="18"/>
-        </w:rPr>
-        <w:t>Respaldo: Arauco Quilicura 15-07-2026</w:t>
-      </w:r>
-    </w:p>
-    <w:p>
-      <w:pPr>
-        <w:spacing w:after="80" w:before="0"/>
-      </w:pPr>
-      <w:r>
-        <w:rPr>
-          <w:rFonts w:ascii="Calibri" w:hAnsi="Calibri" w:eastAsia="Calibri"/>
-          <w:b/>
-          <w:color w:val="2E7AC8"/>
-          <w:sz w:val="26"/>
-        </w:rPr>
-        <w:t>Ago 2026</w:t>
-      </w:r>
-    </w:p>
-    <w:p>
-      <w:pPr>
-        <w:spacing w:after="40" w:before="0"/>
-      </w:pPr>
-      <w:r>
-        <w:rPr>
-          <w:rFonts w:ascii="Calibri" w:hAnsi="Calibri" w:eastAsia="Calibri"/>
-          <w:b/>
-          <w:color w:val="1F4E79"/>
-          <w:sz w:val="24"/>
-        </w:rPr>
-        <w:t>11-08-2026  —  Arauco Maipú</w:t>
-      </w:r>
-    </w:p>
-    <w:p>
-      <w:pPr>
-        <w:spacing w:after="40" w:before="0"/>
-      </w:pPr>
-      <w:r>
-        <w:rPr>
-          <w:rFonts w:ascii="Calibri" w:hAnsi="Calibri" w:eastAsia="Calibri"/>
-          <w:b w:val="0"/>
-          <w:color w:val="444444"/>
-          <w:sz w:val="20"/>
-        </w:rPr>
-        <w:t>Técnico: No indicado en el registro.</w:t>
-      </w:r>
-    </w:p>
-    <w:p>
-      <w:pPr>
-        <w:spacing w:after="20" w:before="0"/>
-      </w:pPr>
-      <w:r>
-        <w:rPr>
-          <w:rFonts w:ascii="Calibri" w:hAnsi="Calibri" w:eastAsia="Calibri"/>
-          <w:b/>
-          <w:sz w:val="22"/>
-        </w:rPr>
-        <w:t>Impulsión Falabella — Acta en Drive</w:t>
-      </w:r>
-    </w:p>
-    <w:p>
-      <w:pPr>
-        <w:spacing w:after="20" w:before="0"/>
-      </w:pPr>
-      <w:r>
-        <w:rPr>
-          <w:rFonts w:ascii="Calibri" w:hAnsi="Calibri" w:eastAsia="Calibri"/>
-          <w:b w:val="0"/>
-          <w:sz w:val="22"/>
-        </w:rPr>
-        <w:t>Respaldo en Drive (sin fila en el Registro de fallas).</w:t>
-      </w:r>
-    </w:p>
-    <w:p>
-      <w:pPr>
-        <w:spacing w:after="80" w:before="0"/>
-      </w:pPr>
-      <w:r>
-        <w:rPr>
-          <w:rFonts w:ascii="Calibri" w:hAnsi="Calibri" w:eastAsia="Calibri"/>
-          <w:b w:val="0"/>
-          <w:color w:val="555555"/>
-          <w:sz w:val="18"/>
-        </w:rPr>
-        <w:t>Respaldo: Impulsión Falabella 11-08-26</w:t>
-      </w:r>
-    </w:p>
-    <w:p>
-      <w:pPr>
-        <w:spacing w:after="40" w:before="0"/>
-      </w:pPr>
-      <w:r>
-        <w:rPr>
-          <w:rFonts w:ascii="Calibri" w:hAnsi="Calibri" w:eastAsia="Calibri"/>
-          <w:b/>
-          <w:color w:val="1F4E79"/>
-          <w:sz w:val="24"/>
-        </w:rPr>
-        <w:t>13-08-2026  —  Arauco Estación</w:t>
-      </w:r>
-    </w:p>
-    <w:p>
-      <w:pPr>
-        <w:spacing w:after="40" w:before="0"/>
-      </w:pPr>
-      <w:r>
-        <w:rPr>
-          <w:rFonts w:ascii="Calibri" w:hAnsi="Calibri" w:eastAsia="Calibri"/>
-          <w:b w:val="0"/>
-          <w:color w:val="444444"/>
-          <w:sz w:val="20"/>
-        </w:rPr>
-        <w:t>Técnico: Anibal Aranda.</w:t>
-      </w:r>
-    </w:p>
-    <w:p>
-      <w:pPr>
-        <w:spacing w:after="20" w:before="0"/>
-      </w:pPr>
-      <w:r>
-        <w:rPr>
-          <w:rFonts w:ascii="Calibri" w:hAnsi="Calibri" w:eastAsia="Calibri"/>
-          <w:b/>
-          <w:sz w:val="22"/>
-        </w:rPr>
-        <w:t>ESTANQUE NORTE LOCALES  (folio 2257) — Mtto Correctivo — Hídrica — Solenoide</w:t>
-      </w:r>
-    </w:p>
-    <w:p>
-      <w:pPr>
-        <w:spacing w:after="20" w:before="0"/>
-      </w:pPr>
-      <w:r>
-        <w:rPr>
-          <w:rFonts w:ascii="Calibri" w:hAnsi="Calibri" w:eastAsia="Calibri"/>
-          <w:b w:val="0"/>
-          <w:sz w:val="22"/>
-        </w:rPr>
-        <w:t>Cambio de solenoide NC a NO</w:t>
-      </w:r>
-    </w:p>
-    <w:p>
-      <w:pPr>
-        <w:spacing w:after="80" w:before="0"/>
-      </w:pPr>
-      <w:r>
-        <w:rPr>
-          <w:rFonts w:ascii="Calibri" w:hAnsi="Calibri" w:eastAsia="Calibri"/>
-          <w:b w:val="0"/>
-          <w:color w:val="555555"/>
-          <w:sz w:val="18"/>
-        </w:rPr>
-        <w:t>Respaldo: folio_2258_2026-08-13_MAE_ESTANQUE_NORTE_LOCALES_20260813_171505.pdf</w:t>
-      </w:r>
-    </w:p>
-    <w:p>
-      <w:pPr>
-        <w:spacing w:after="20" w:before="0"/>
-      </w:pPr>
-      <w:r>
-        <w:rPr>
-          <w:rFonts w:ascii="Calibri" w:hAnsi="Calibri" w:eastAsia="Calibri"/>
-          <w:b/>
-          <w:sz w:val="22"/>
-        </w:rPr>
-        <w:t>ESTANQUE NORTE LOCALES  (folio 2258) — Mtto Correctivo — Hídrica — Solenoide</w:t>
-      </w:r>
-    </w:p>
-    <w:p>
-      <w:pPr>
-        <w:spacing w:after="20" w:before="0"/>
-      </w:pPr>
-      <w:r>
-        <w:rPr>
-          <w:rFonts w:ascii="Calibri" w:hAnsi="Calibri" w:eastAsia="Calibri"/>
-          <w:b w:val="0"/>
-          <w:sz w:val="22"/>
-        </w:rPr>
-        <w:t>Cambio de solenoide NC a NO</w:t>
-      </w:r>
-    </w:p>
-    <w:p>
-      <w:pPr>
-        <w:spacing w:after="80" w:before="0"/>
-      </w:pPr>
-      <w:r>
-        <w:rPr>
-          <w:rFonts w:ascii="Calibri" w:hAnsi="Calibri" w:eastAsia="Calibri"/>
-          <w:b w:val="0"/>
-          <w:color w:val="555555"/>
-          <w:sz w:val="18"/>
-        </w:rPr>
-        <w:t>Respaldo: folio_2257_2026-08-13_MAE_ESTANQUE_NORTE_LOCALES_20260813_171436.pdf</w:t>
-      </w:r>
-    </w:p>
-    <w:p>
-      <w:pPr>
-        <w:spacing w:after="20" w:before="0"/>
-      </w:pPr>
-      <w:r>
-        <w:rPr>
-          <w:rFonts w:ascii="Calibri" w:hAnsi="Calibri" w:eastAsia="Calibri"/>
-          <w:b/>
-          <w:sz w:val="22"/>
-        </w:rPr>
-        <w:t>PIZZA HUT  (folio 2259) — Mtto Correctivo — Hídrica — Solenoide</w:t>
-      </w:r>
-    </w:p>
-    <w:p>
-      <w:pPr>
-        <w:spacing w:after="20" w:before="0"/>
-      </w:pPr>
-      <w:r>
-        <w:rPr>
-          <w:rFonts w:ascii="Calibri" w:hAnsi="Calibri" w:eastAsia="Calibri"/>
-          <w:b w:val="0"/>
-          <w:sz w:val="22"/>
-        </w:rPr>
-        <w:t>Cambio de solenoide NC a NO</w:t>
-      </w:r>
-    </w:p>
-    <w:p>
-      <w:pPr>
-        <w:spacing w:after="80" w:before="0"/>
-      </w:pPr>
-      <w:r>
-        <w:rPr>
-          <w:rFonts w:ascii="Calibri" w:hAnsi="Calibri" w:eastAsia="Calibri"/>
-          <w:b w:val="0"/>
-          <w:color w:val="555555"/>
-          <w:sz w:val="18"/>
-        </w:rPr>
-        <w:t>Respaldo: folio_2259_2026-08-13_MAE_PIZZA_HUT_20260813_171543.pdf</w:t>
-      </w:r>
-    </w:p>
-    <w:p>
-      <w:pPr>
-        <w:spacing w:after="20" w:before="0"/>
-      </w:pPr>
-      <w:r>
-        <w:rPr>
-          <w:rFonts w:ascii="Calibri" w:hAnsi="Calibri" w:eastAsia="Calibri"/>
-          <w:b/>
-          <w:sz w:val="22"/>
-        </w:rPr>
-        <w:t>SALA DE BOMBAS ESTANQUE SUR  (folio 2260) — Mtto Correctivo — Hídrica — Solenoide</w:t>
-      </w:r>
-    </w:p>
-    <w:p>
-      <w:pPr>
-        <w:spacing w:after="20" w:before="0"/>
-      </w:pPr>
-      <w:r>
-        <w:rPr>
-          <w:rFonts w:ascii="Calibri" w:hAnsi="Calibri" w:eastAsia="Calibri"/>
-          <w:b w:val="0"/>
-          <w:sz w:val="22"/>
-        </w:rPr>
-        <w:t>Cambio de solenoide NC a NO</w:t>
-      </w:r>
-    </w:p>
-    <w:p>
-      <w:pPr>
-        <w:spacing w:after="80" w:before="0"/>
-      </w:pPr>
-      <w:r>
-        <w:rPr>
-          <w:rFonts w:ascii="Calibri" w:hAnsi="Calibri" w:eastAsia="Calibri"/>
-          <w:b w:val="0"/>
-          <w:color w:val="555555"/>
-          <w:sz w:val="18"/>
-        </w:rPr>
-        <w:t>Respaldo: folio_2260_2026-08-13_MAE_SALA_DE_BOMBAS_ESTANQUE_SUR_20260813_171623.pdf</w:t>
-      </w:r>
-    </w:p>
-    <w:p>
-      <w:pPr>
-        <w:spacing w:after="80" w:before="0"/>
-      </w:pPr>
-      <w:r>
-        <w:rPr>
-          <w:rFonts w:ascii="Calibri" w:hAnsi="Calibri" w:eastAsia="Calibri"/>
-          <w:b/>
-          <w:color w:val="2E7AC8"/>
-          <w:sz w:val="26"/>
-        </w:rPr>
-        <w:t>Sep 2026</w:t>
-      </w:r>
-    </w:p>
-    <w:p>
-      <w:pPr>
-        <w:spacing w:after="40" w:before="0"/>
-      </w:pPr>
-      <w:r>
-        <w:rPr>
-          <w:rFonts w:ascii="Calibri" w:hAnsi="Calibri" w:eastAsia="Calibri"/>
-          <w:b/>
-          <w:color w:val="1F4E79"/>
-          <w:sz w:val="24"/>
-        </w:rPr>
-        <w:t>14-09-2026  —  Arauco Estación</w:t>
+        <w:t>21-09-2026  —  Arauco Buenaventura</w:t>
       </w:r>
     </w:p>
     <w:p>
@@ -3676,12 +2064,12 @@
           <w:b/>
           <w:sz w:val="22"/>
         </w:rPr>
-        <w:t>ESTANQUE NORTE LOCALES  (folio 2309) — Mtto Correctivo — Comunicación — Max 232</w:t>
+        <w:t>San Ignacio 500</w:t>
       </w:r>
     </w:p>
     <w:p>
       <w:pPr>
-        <w:spacing w:after="20" w:before="0"/>
+        <w:spacing w:after="60" w:before="0"/>
       </w:pPr>
       <w:r>
         <w:rPr>
@@ -3689,237 +2077,7 @@
           <w:b w:val="0"/>
           <w:sz w:val="22"/>
         </w:rPr>
-        <w:t>Max 232 con falla, está es reemplazada</w:t>
-      </w:r>
-    </w:p>
-    <w:p>
-      <w:pPr>
-        <w:spacing w:after="80" w:before="0"/>
-      </w:pPr>
-      <w:r>
-        <w:rPr>
-          <w:rFonts w:ascii="Calibri" w:hAnsi="Calibri" w:eastAsia="Calibri"/>
-          <w:b w:val="0"/>
-          <w:color w:val="555555"/>
-          <w:sz w:val="18"/>
-        </w:rPr>
-        <w:t>Respaldo: folio_2309_2026-09-14_MAE_ESTANQUE_NORTE_LOCALES_20260914_172545.pdf</w:t>
-      </w:r>
-    </w:p>
-    <w:p>
-      <w:pPr>
-        <w:spacing w:after="40" w:before="0"/>
-      </w:pPr>
-      <w:r>
-        <w:rPr>
-          <w:rFonts w:ascii="Calibri" w:hAnsi="Calibri" w:eastAsia="Calibri"/>
-          <w:b/>
-          <w:color w:val="1F4E79"/>
-          <w:sz w:val="24"/>
-        </w:rPr>
-        <w:t>21-09-2026  —  Arauco Buenaventura</w:t>
-      </w:r>
-    </w:p>
-    <w:p>
-      <w:pPr>
-        <w:spacing w:after="40" w:before="0"/>
-      </w:pPr>
-      <w:r>
-        <w:rPr>
-          <w:rFonts w:ascii="Calibri" w:hAnsi="Calibri" w:eastAsia="Calibri"/>
-          <w:b w:val="0"/>
-          <w:color w:val="444444"/>
-          <w:sz w:val="20"/>
-        </w:rPr>
-        <w:t>Técnico: Mauricio Orellana.</w:t>
-      </w:r>
-    </w:p>
-    <w:p>
-      <w:pPr>
-        <w:spacing w:after="20" w:before="0"/>
-      </w:pPr>
-      <w:r>
-        <w:rPr>
-          <w:rFonts w:ascii="Calibri" w:hAnsi="Calibri" w:eastAsia="Calibri"/>
-          <w:b/>
-          <w:sz w:val="22"/>
-        </w:rPr>
-        <w:t>SAN IGNACIO 500  (folio 2310) — Mtto Correctivo — Electrónica — Ruido</w:t>
-      </w:r>
-    </w:p>
-    <w:p>
-      <w:pPr>
-        <w:spacing w:after="20" w:before="0"/>
-      </w:pPr>
-      <w:r>
-        <w:rPr>
-          <w:rFonts w:ascii="Calibri" w:hAnsi="Calibri" w:eastAsia="Calibri"/>
-          <w:b w:val="0"/>
-          <w:sz w:val="22"/>
-        </w:rPr>
-        <w:t>Ruido eléctrico provoca desconfigura ion de id + horarios de programación apertura y corte válvula control</w:t>
-      </w:r>
-    </w:p>
-    <w:p>
-      <w:pPr>
-        <w:spacing w:after="80" w:before="0"/>
-      </w:pPr>
-      <w:r>
-        <w:rPr>
-          <w:rFonts w:ascii="Calibri" w:hAnsi="Calibri" w:eastAsia="Calibri"/>
-          <w:b w:val="0"/>
-          <w:color w:val="555555"/>
-          <w:sz w:val="18"/>
-        </w:rPr>
-        <w:t>Respaldo: folio_2310_2026-09-21_BOM_SAN_IGNACIO_500_20260921_112410.pdf</w:t>
-      </w:r>
-    </w:p>
-    <w:p>
-      <w:pPr>
-        <w:spacing w:after="40" w:before="0"/>
-      </w:pPr>
-      <w:r>
-        <w:rPr>
-          <w:rFonts w:ascii="Calibri" w:hAnsi="Calibri" w:eastAsia="Calibri"/>
-          <w:b/>
-          <w:color w:val="1F4E79"/>
-          <w:sz w:val="24"/>
-        </w:rPr>
-        <w:t>23-09-2026  —  Arauco Estación</w:t>
-      </w:r>
-    </w:p>
-    <w:p>
-      <w:pPr>
-        <w:spacing w:after="40" w:before="0"/>
-      </w:pPr>
-      <w:r>
-        <w:rPr>
-          <w:rFonts w:ascii="Calibri" w:hAnsi="Calibri" w:eastAsia="Calibri"/>
-          <w:b w:val="0"/>
-          <w:color w:val="444444"/>
-          <w:sz w:val="20"/>
-        </w:rPr>
-        <w:t>Técnico: Mauricio Orellana.</w:t>
-      </w:r>
-    </w:p>
-    <w:p>
-      <w:pPr>
-        <w:spacing w:after="20" w:before="0"/>
-      </w:pPr>
-      <w:r>
-        <w:rPr>
-          <w:rFonts w:ascii="Calibri" w:hAnsi="Calibri" w:eastAsia="Calibri"/>
-          <w:b/>
-          <w:sz w:val="22"/>
-        </w:rPr>
-        <w:t>ESTANQUE CARGA ESTANQUE SUR  (folio 2313) — Mtto Preventivo — Up grade — Instalación</w:t>
-      </w:r>
-    </w:p>
-    <w:p>
-      <w:pPr>
-        <w:spacing w:after="20" w:before="0"/>
-      </w:pPr>
-      <w:r>
-        <w:rPr>
-          <w:rFonts w:ascii="Calibri" w:hAnsi="Calibri" w:eastAsia="Calibri"/>
-          <w:b w:val="0"/>
-          <w:sz w:val="22"/>
-        </w:rPr>
-        <w:t>Instalación y empalme de disyuntor + automático</w:t>
-      </w:r>
-    </w:p>
-    <w:p>
-      <w:pPr>
-        <w:spacing w:after="80" w:before="0"/>
-      </w:pPr>
-      <w:r>
-        <w:rPr>
-          <w:rFonts w:ascii="Calibri" w:hAnsi="Calibri" w:eastAsia="Calibri"/>
-          <w:b w:val="0"/>
-          <w:color w:val="555555"/>
-          <w:sz w:val="18"/>
-        </w:rPr>
-        <w:t>Respaldo: folio_2314_2026-09-23_MAE_ESTANQUE_CARGA_ESTANQUE_SUR_20260923_125634.pdf</w:t>
-      </w:r>
-    </w:p>
-    <w:p>
-      <w:pPr>
-        <w:spacing w:after="20" w:before="0"/>
-      </w:pPr>
-      <w:r>
-        <w:rPr>
-          <w:rFonts w:ascii="Calibri" w:hAnsi="Calibri" w:eastAsia="Calibri"/>
-          <w:b/>
-          <w:sz w:val="22"/>
-        </w:rPr>
-        <w:t>ESTANQUE CARGA ESTANQUE SUR  (folio 2314) — Mtto Preventivo — Up grade — Instalación</w:t>
-      </w:r>
-    </w:p>
-    <w:p>
-      <w:pPr>
-        <w:spacing w:after="20" w:before="0"/>
-      </w:pPr>
-      <w:r>
-        <w:rPr>
-          <w:rFonts w:ascii="Calibri" w:hAnsi="Calibri" w:eastAsia="Calibri"/>
-          <w:b w:val="0"/>
-          <w:sz w:val="22"/>
-        </w:rPr>
-        <w:t>Instalación y empalme de disyuntor + automático</w:t>
-      </w:r>
-    </w:p>
-    <w:p>
-      <w:pPr>
-        <w:spacing w:after="80" w:before="0"/>
-      </w:pPr>
-      <w:r>
-        <w:rPr>
-          <w:rFonts w:ascii="Calibri" w:hAnsi="Calibri" w:eastAsia="Calibri"/>
-          <w:b w:val="0"/>
-          <w:color w:val="555555"/>
-          <w:sz w:val="18"/>
-        </w:rPr>
-        <w:t>Respaldo: folio_2313_2026-09-23_MAE_ESTANQUE_CARGA_ESTANQUE_SUR_20260923_125506.pdf</w:t>
-      </w:r>
-    </w:p>
-    <w:p>
-      <w:pPr>
-        <w:spacing w:after="20" w:before="0"/>
-      </w:pPr>
-      <w:r>
-        <w:rPr>
-          <w:rFonts w:ascii="Calibri" w:hAnsi="Calibri" w:eastAsia="Calibri"/>
-          <w:b/>
-          <w:sz w:val="22"/>
-        </w:rPr>
-        <w:t>ESTANQUE NORTE LOCALES  (folio 2315) — Mtto Preventivo — Up grade — Instalación</w:t>
-      </w:r>
-    </w:p>
-    <w:p>
-      <w:pPr>
-        <w:spacing w:after="20" w:before="0"/>
-      </w:pPr>
-      <w:r>
-        <w:rPr>
-          <w:rFonts w:ascii="Calibri" w:hAnsi="Calibri" w:eastAsia="Calibri"/>
-          <w:b w:val="0"/>
-          <w:sz w:val="22"/>
-        </w:rPr>
-        <w:t>Instalación y empalme de disyuntor + automático</w:t>
-      </w:r>
-    </w:p>
-    <w:p>
-      <w:pPr>
-        <w:spacing w:after="80" w:before="0"/>
-      </w:pPr>
-      <w:r>
-        <w:rPr>
-          <w:rFonts w:ascii="Calibri" w:hAnsi="Calibri" w:eastAsia="Calibri"/>
-          <w:b w:val="0"/>
-          <w:color w:val="555555"/>
-          <w:sz w:val="18"/>
-        </w:rPr>
-        <w:t>Respaldo: folio_2315_2026-09-23_MAE_ESTANQUE_NORTE_LOCALES_20260923_125930.pdf</w:t>
+        <w:t>Ruido eléctrico. Desconfigura el ID y los horarios de apertura y corte de la válvula. Se reprograma y se recupera la data.</w:t>
       </w:r>
     </w:p>
     <w:p>
@@ -3947,7 +2105,7 @@
           <w:color w:val="444444"/>
           <w:sz w:val="20"/>
         </w:rPr>
-        <w:t>Técnico: Anibal Aranda.</w:t>
+        <w:t>Técnico: Aníbal Aranda.</w:t>
       </w:r>
     </w:p>
     <w:p>
@@ -3960,12 +2118,12 @@
           <w:b/>
           <w:sz w:val="22"/>
         </w:rPr>
-        <w:t>ESTANQUE NORTE LOCALES  (folio 2325) — Mtto Correctivo — Hídrica — Reparación</w:t>
+        <w:t>Estanque norte locales</w:t>
       </w:r>
     </w:p>
     <w:p>
       <w:pPr>
-        <w:spacing w:after="20" w:before="0"/>
+        <w:spacing w:after="60" w:before="0"/>
       </w:pPr>
       <w:r>
         <w:rPr>
@@ -3973,12 +2131,12 @@
           <w:b w:val="0"/>
           <w:sz w:val="22"/>
         </w:rPr>
-        <w:t>Análisis de causa raíz: La falla se debió a un esfuerzo mecánico axial continuo generado por falta de anclajes fijos en la línea. Dado que el sistema operó durante más de cuatro meses de manera continua sin presentar novedades ni fugas, se descarta un defecto en el armado o sellado inicial de la unión. El día lunes 28-09-26 se asistirá a terreno para la instalación de soportes y abrazaderas de anclaje adicional en la línea, inmovilizando la tubería de PPR para absorber el empuje axial y prevenir futuros desacoples.</w:t>
+        <w:t>Desacople de la tubería por esfuerzo axial, por falta de anclajes. Se descarta un defecto del armado inicial: el sistema operó más de cuatro meses sin fugas.</w:t>
       </w:r>
     </w:p>
     <w:p>
       <w:pPr>
-        <w:spacing w:after="80" w:before="0"/>
+        <w:spacing w:after="120" w:before="0"/>
       </w:pPr>
       <w:r>
         <w:rPr>
@@ -3987,157 +2145,7 @@
           <w:color w:val="555555"/>
           <w:sz w:val="18"/>
         </w:rPr>
-        <w:t>Respaldo: folio_2325_2026-09-27_MAE_ESTANQUE_NORTE_LOCALES_20260927_001724.pdf</w:t>
-      </w:r>
-    </w:p>
-    <w:p>
-      <w:pPr>
-        <w:spacing w:after="40" w:before="0"/>
-      </w:pPr>
-      <w:r>
-        <w:rPr>
-          <w:rFonts w:ascii="Calibri" w:hAnsi="Calibri" w:eastAsia="Calibri"/>
-          <w:b/>
-          <w:color w:val="1F4E79"/>
-          <w:sz w:val="24"/>
-        </w:rPr>
-        <w:t>28-09-2026  —  Arauco Estación</w:t>
-      </w:r>
-    </w:p>
-    <w:p>
-      <w:pPr>
-        <w:spacing w:after="40" w:before="0"/>
-      </w:pPr>
-      <w:r>
-        <w:rPr>
-          <w:rFonts w:ascii="Calibri" w:hAnsi="Calibri" w:eastAsia="Calibri"/>
-          <w:b w:val="0"/>
-          <w:color w:val="444444"/>
-          <w:sz w:val="20"/>
-        </w:rPr>
-        <w:t>Técnico: Mauricio Orellana.</w:t>
-      </w:r>
-    </w:p>
-    <w:p>
-      <w:pPr>
-        <w:spacing w:after="20" w:before="0"/>
-      </w:pPr>
-      <w:r>
-        <w:rPr>
-          <w:rFonts w:ascii="Calibri" w:hAnsi="Calibri" w:eastAsia="Calibri"/>
-          <w:b/>
-          <w:sz w:val="22"/>
-        </w:rPr>
-        <w:t>ESTANQUE NORTE LOCALES  (folio 2326) — Mtto Preventivo — Hídrica — Revisión tecnica</w:t>
-      </w:r>
-    </w:p>
-    <w:p>
-      <w:pPr>
-        <w:spacing w:after="20" w:before="0"/>
-      </w:pPr>
-      <w:r>
-        <w:rPr>
-          <w:rFonts w:ascii="Calibri" w:hAnsi="Calibri" w:eastAsia="Calibri"/>
-          <w:b w:val="0"/>
-          <w:sz w:val="22"/>
-        </w:rPr>
-        <w:t>Instalación refuerzo a la tracción a matriz estanque nortes locales.</w:t>
-      </w:r>
-    </w:p>
-    <w:p>
-      <w:pPr>
-        <w:spacing w:after="80" w:before="0"/>
-      </w:pPr>
-      <w:r>
-        <w:rPr>
-          <w:rFonts w:ascii="Calibri" w:hAnsi="Calibri" w:eastAsia="Calibri"/>
-          <w:b w:val="0"/>
-          <w:color w:val="555555"/>
-          <w:sz w:val="18"/>
-        </w:rPr>
-        <w:t>Respaldo: folio_2326_2026-09-28_MAE_ESTANQUE_NORTE_LOCALES_20260928_135103.pdf</w:t>
-      </w:r>
-    </w:p>
-    <w:p>
-      <w:pPr>
-        <w:spacing w:after="80" w:before="0"/>
-      </w:pPr>
-      <w:r>
-        <w:rPr>
-          <w:rFonts w:ascii="Calibri" w:hAnsi="Calibri" w:eastAsia="Calibri"/>
-          <w:b/>
-          <w:color w:val="2E7AC8"/>
-          <w:sz w:val="26"/>
-        </w:rPr>
-        <w:t>Oct 2026</w:t>
-      </w:r>
-    </w:p>
-    <w:p>
-      <w:pPr>
-        <w:spacing w:after="40" w:before="0"/>
-      </w:pPr>
-      <w:r>
-        <w:rPr>
-          <w:rFonts w:ascii="Calibri" w:hAnsi="Calibri" w:eastAsia="Calibri"/>
-          <w:b/>
-          <w:color w:val="1F4E79"/>
-          <w:sz w:val="24"/>
-        </w:rPr>
-        <w:t>01-10-2026  —  Arauco Estación</w:t>
-      </w:r>
-    </w:p>
-    <w:p>
-      <w:pPr>
-        <w:spacing w:after="40" w:before="0"/>
-      </w:pPr>
-      <w:r>
-        <w:rPr>
-          <w:rFonts w:ascii="Calibri" w:hAnsi="Calibri" w:eastAsia="Calibri"/>
-          <w:b w:val="0"/>
-          <w:color w:val="444444"/>
-          <w:sz w:val="20"/>
-        </w:rPr>
-        <w:t>Técnico: Mauricio Orellana.</w:t>
-      </w:r>
-    </w:p>
-    <w:p>
-      <w:pPr>
-        <w:spacing w:after="20" w:before="0"/>
-      </w:pPr>
-      <w:r>
-        <w:rPr>
-          <w:rFonts w:ascii="Calibri" w:hAnsi="Calibri" w:eastAsia="Calibri"/>
-          <w:b/>
-          <w:sz w:val="22"/>
-        </w:rPr>
-        <w:t>ESTANQUE NORTE LOCALES  (folio 2330) — Mtto Preventivo — Hídrica — Revisión tecnica</w:t>
-      </w:r>
-    </w:p>
-    <w:p>
-      <w:pPr>
-        <w:spacing w:after="20" w:before="0"/>
-      </w:pPr>
-      <w:r>
-        <w:rPr>
-          <w:rFonts w:ascii="Calibri" w:hAnsi="Calibri" w:eastAsia="Calibri"/>
-          <w:b w:val="0"/>
-          <w:sz w:val="22"/>
-        </w:rPr>
-        <w:t>Se visita matriz locales norte, por aviso de posible desplazamiento de tubería.</w:t>
-      </w:r>
-    </w:p>
-    <w:p>
-      <w:pPr>
-        <w:spacing w:after="80" w:before="0"/>
-      </w:pPr>
-      <w:r>
-        <w:rPr>
-          <w:rFonts w:ascii="Calibri" w:hAnsi="Calibri" w:eastAsia="Calibri"/>
-          <w:b w:val="0"/>
-          <w:color w:val="555555"/>
-          <w:sz w:val="18"/>
-        </w:rPr>
-        <w:t>Respaldo: folio_2330_2026-10-01_MAE_ESTANQUE_NORTE_LOCALES_20261001_095603.pdf</w:t>
+        <w:t>El 28-09 se instalaron anclajes. Esa instalación no se cuenta.</w:t>
       </w:r>
     </w:p>
     <w:p>
@@ -4151,7 +2159,7 @@
           <w:color w:val="1F4E79"/>
           <w:sz w:val="28"/>
         </w:rPr>
-        <w:t>Notas de lectura</w:t>
+        <w:t>Qué quedó fuera</w:t>
       </w:r>
     </w:p>
     <w:p>
@@ -4164,7 +2172,7 @@
           <w:b w:val="0"/>
           <w:sz w:val="20"/>
         </w:rPr>
-        <w:t>•  Arauco Estación aparece en la planilla histórica como PAE y, desde agosto de 2026, como MAE. En este informe ambos códigos son el mismo mall.</w:t>
+        <w:t>•  Instalaciones y puestas en marcha: collarín y gabinete en Estación (22-01), válvulas de control del estanque norte (29-05), instalación total de estanques norte y sur (05-06), disyuntores (23-09), anclajes del 28-09, puntos nuevos en Maipú y El Bosque, equipo de monitoreo en Falabella (11-08) y la visita técnica de factibilidad del 23-02.</w:t>
       </w:r>
     </w:p>
     <w:p>
@@ -4177,7 +2185,7 @@
           <w:b w:val="0"/>
           <w:sz w:val="20"/>
         </w:rPr>
-        <w:t>•  Varias actas de enero a julio están solo como PDF en Drive y no tienen fila en el Registro de fallas. Esas visitas igual se cuentan; el trabajo se describe con el nombre del archivo.</w:t>
+        <w:t>•  Reubicaciones: red de incendio en Quilicura (17-02), sistemas de Curauma (29-04) y reinstalación del equipo en El Bosque (15-05).</w:t>
       </w:r>
     </w:p>
     <w:p>
@@ -4190,7 +2198,7 @@
           <w:b w:val="0"/>
           <w:sz w:val="20"/>
         </w:rPr>
-        <w:t>•  El archivo «13-11-2026 MAE» quedó fuera: la fecha del nombre es posterior al corte y el PDF se subió el 26-02-2026, así que no corresponde a una visita realizada en 2026.</w:t>
+        <w:t>•  Sin defecto: lecturas de validación, descargas de memoria y revisiones en las que el equipo operaba bien (DL y Fredo en Kennedy el 04-03, revisión del 01-10 en Estación, San Ignacio 300 el 31-03).</w:t>
       </w:r>
     </w:p>
     <w:p>
@@ -4203,60 +2211,7 @@
           <w:b w:val="0"/>
           <w:sz w:val="20"/>
         </w:rPr>
-        <w:t>•  Cuando el nombre del archivo indica otro mall que la carpeta donde está guardado (por ejemplo un PDF «BOM» dentro de Quilicura), la visita se asigna según el nombre del archivo.</w:t>
-      </w:r>
-    </w:p>
-    <w:p>
-      <w:pPr>
-        <w:spacing w:after="80" w:before="0"/>
-      </w:pPr>
-      <w:r>
-        <w:rPr>
-          <w:rFonts w:ascii="Calibri" w:hAnsi="Calibri" w:eastAsia="Calibri"/>
-          <w:b w:val="0"/>
-          <w:sz w:val="20"/>
-        </w:rPr>
-        <w:t>•  Los informes «Visita técnicas - MAE» del 05-03-2026 y del 23-03-2026 documentan la misma visita técnica del 23-02-2026 (factibilidad de reubicación del control On/Off en baños públicos; contacto Sergio Fuenzalida).</w:t>
-      </w:r>
-    </w:p>
-    <w:p>
-      <w:pPr>
-        <w:spacing w:after="80" w:before="0"/>
-      </w:pPr>
-      <w:r>
-        <w:rPr>
-          <w:rFonts w:ascii="Calibri" w:hAnsi="Calibri" w:eastAsia="Calibri"/>
-          <w:b/>
-          <w:color w:val="1F4E79"/>
-          <w:sz w:val="28"/>
-        </w:rPr>
-        <w:t>Enlaces</w:t>
-      </w:r>
-    </w:p>
-    <w:p>
-      <w:pPr>
-        <w:spacing w:after="40" w:before="0"/>
-      </w:pPr>
-      <w:r>
-        <w:rPr>
-          <w:rFonts w:ascii="Calibri" w:hAnsi="Calibri" w:eastAsia="Calibri"/>
-          <w:b w:val="0"/>
-          <w:sz w:val="18"/>
-        </w:rPr>
-        <w:t>Registro de fallas WES: https://docs.google.com/spreadsheets/d/1GlRn7QXWEre7ziau29ojR5lTl-bZ8T3mCT3cD93HZgM/edit</w:t>
-      </w:r>
-    </w:p>
-    <w:p>
-      <w:pPr>
-        <w:spacing w:after="160" w:before="0"/>
-      </w:pPr>
-      <w:r>
-        <w:rPr>
-          <w:rFonts w:ascii="Calibri" w:hAnsi="Calibri" w:eastAsia="Calibri"/>
-          <w:b w:val="0"/>
-          <w:sz w:val="18"/>
-        </w:rPr>
-        <w:t>Actas de Mantención / Parque Arauco: https://drive.google.com/drive/folders/1gw24e9Z-AWePgBWBC_53zQacsfmuiUyv</w:t>
+        <w:t>•  Quilicura no tiene una visita con defecto en este corte. El acta del 15-07 archivada en esa carpeta corresponde a San Ignacio 500, de Buenaventura.</w:t>
       </w:r>
     </w:p>
     <w:p>
@@ -4270,7 +2225,7 @@
           <w:color w:val="666666"/>
           <w:sz w:val="18"/>
         </w:rPr>
-        <w:t>Informe generado el 6 de octubre de 2026 a partir del registro operativo y de las actas en Drive.</w:t>
+        <w:t>Informe actualizado el 6 de octubre de 2026.</w:t>
       </w:r>
     </w:p>
     <w:sectPr>
@@ -4646,10 +2601,6 @@
     <w:name w:val="Normal"/>
     <w:qFormat/>
     <w:rsid w:val="00FC693F"/>
-    <w:rPr>
-      <w:rFonts w:ascii="Calibri" w:hAnsi="Calibri"/>
-      <w:sz w:val="22"/>
-    </w:rPr>
   </w:style>
   <w:style w:type="paragraph" w:styleId="Header">
     <w:name w:val="header"/>

</xml_diff>

<commit_message>
Agrupa en una visita los puntos del mismo mall atendidos el mismo día.
El total sigue en 20 visitas; los días con más de un punto quedan listados juntos.

Co-authored-by: anibaloperacionesWes <anibaloperacionesWes@users.noreply.github.com>
</commit_message>
<xml_diff>
--- a/reports/Parque_Arauco/Visitas_2026/Visitas_Parque_Arauco_2026.docx
+++ b/reports/Parque_Arauco/Visitas_2026/Visitas_Parque_Arauco_2026.docx
@@ -46,7 +46,7 @@
     </w:p>
     <w:p>
       <w:pPr>
-        <w:spacing w:after="160" w:before="0"/>
+        <w:spacing w:after="120" w:before="0"/>
       </w:pPr>
       <w:r>
         <w:rPr>
@@ -54,7 +54,20 @@
           <w:b w:val="0"/>
           <w:sz w:val="22"/>
         </w:rPr>
-        <w:t>Quedan 20 visitas en las que se encontró un defecto (24 puntos o trabajos). Una visita es un mall en un día. Se dejaron fuera las instalaciones, reubicaciones, puestas en marcha, lecturas de validación y las revisiones en las que el equipo no tenía falla.</w:t>
+        <w:t>Quedan 20 visitas con defecto. Si en un mismo día se atendió más de un punto del mismo mall, cuenta como una sola visita y los puntos se listan debajo. Así hay 20 visitas y 24 puntos. Hay 3 días en esa situación.</w:t>
+      </w:r>
+    </w:p>
+    <w:p>
+      <w:pPr>
+        <w:spacing w:after="160" w:before="0"/>
+      </w:pPr>
+      <w:r>
+        <w:rPr>
+          <w:rFonts w:ascii="Calibri" w:hAnsi="Calibri" w:eastAsia="Calibri"/>
+          <w:b w:val="0"/>
+          <w:sz w:val="22"/>
+        </w:rPr>
+        <w:t>Se dejaron fuera las instalaciones, reubicaciones, puestas en marcha, lecturas de validación y las revisiones en las que el equipo no tenía falla.</w:t>
       </w:r>
     </w:p>
     <w:p>
@@ -705,6 +718,252 @@
     </w:tbl>
     <w:p>
       <w:pPr>
+        <w:spacing w:after="120" w:before="0"/>
+      </w:pPr>
+      <w:r>
+        <w:rPr>
+          <w:rFonts w:ascii="Calibri" w:hAnsi="Calibri" w:eastAsia="Calibri"/>
+          <w:b/>
+          <w:color w:val="1F4E79"/>
+          <w:sz w:val="28"/>
+        </w:rPr>
+        <w:t>Mismo día, más de un punto</w:t>
+      </w:r>
+    </w:p>
+    <w:p>
+      <w:pPr>
+        <w:spacing w:after="120" w:before="0"/>
+      </w:pPr>
+      <w:r>
+        <w:rPr>
+          <w:rFonts w:ascii="Calibri" w:hAnsi="Calibri" w:eastAsia="Calibri"/>
+          <w:b w:val="0"/>
+          <w:color w:val="555555"/>
+          <w:sz w:val="20"/>
+        </w:rPr>
+        <w:t>Estos días no se multiplican. Sigue siendo una visita al mall, con los puntos que tuvieron defecto.</w:t>
+      </w:r>
+    </w:p>
+    <w:tbl>
+      <w:tblPr>
+        <w:tblStyle w:val="TableGrid"/>
+        <w:tblW w:type="auto" w:w="0"/>
+        <w:tblLook w:firstColumn="1" w:firstRow="1" w:lastColumn="0" w:lastRow="0" w:noHBand="0" w:noVBand="1" w:val="04A0"/>
+      </w:tblPr>
+      <w:tblGrid>
+        <w:gridCol w:w="3437"/>
+        <w:gridCol w:w="3437"/>
+        <w:gridCol w:w="3437"/>
+      </w:tblGrid>
+      <w:tr>
+        <w:tc>
+          <w:tcPr>
+            <w:tcW w:type="dxa" w:w="3437"/>
+            <w:shd w:fill="1F4E79" w:val="clear"/>
+          </w:tcPr>
+          <w:p>
+            <w:r/>
+            <w:r>
+              <w:rPr>
+                <w:rFonts w:ascii="Calibri" w:hAnsi="Calibri" w:eastAsia="Calibri"/>
+                <w:b/>
+                <w:color w:val="FFFFFF"/>
+                <w:sz w:val="20"/>
+              </w:rPr>
+              <w:t>Fecha</w:t>
+            </w:r>
+          </w:p>
+        </w:tc>
+        <w:tc>
+          <w:tcPr>
+            <w:tcW w:type="dxa" w:w="3437"/>
+            <w:shd w:fill="1F4E79" w:val="clear"/>
+          </w:tcPr>
+          <w:p>
+            <w:r/>
+            <w:r>
+              <w:rPr>
+                <w:rFonts w:ascii="Calibri" w:hAnsi="Calibri" w:eastAsia="Calibri"/>
+                <w:b/>
+                <w:color w:val="FFFFFF"/>
+                <w:sz w:val="20"/>
+              </w:rPr>
+              <w:t>Mall</w:t>
+            </w:r>
+          </w:p>
+        </w:tc>
+        <w:tc>
+          <w:tcPr>
+            <w:tcW w:type="dxa" w:w="3437"/>
+            <w:shd w:fill="1F4E79" w:val="clear"/>
+          </w:tcPr>
+          <w:p>
+            <w:r/>
+            <w:r>
+              <w:rPr>
+                <w:rFonts w:ascii="Calibri" w:hAnsi="Calibri" w:eastAsia="Calibri"/>
+                <w:b/>
+                <w:color w:val="FFFFFF"/>
+                <w:sz w:val="20"/>
+              </w:rPr>
+              <w:t>Puntos de esa visita</w:t>
+            </w:r>
+          </w:p>
+        </w:tc>
+      </w:tr>
+      <w:tr>
+        <w:tc>
+          <w:tcPr>
+            <w:tcW w:type="dxa" w:w="3437"/>
+          </w:tcPr>
+          <w:p>
+            <w:r/>
+            <w:r>
+              <w:rPr>
+                <w:rFonts w:ascii="Calibri" w:hAnsi="Calibri" w:eastAsia="Calibri"/>
+                <w:b/>
+                <w:sz w:val="20"/>
+              </w:rPr>
+              <w:t>19-03-2026</w:t>
+            </w:r>
+          </w:p>
+        </w:tc>
+        <w:tc>
+          <w:tcPr>
+            <w:tcW w:type="dxa" w:w="3437"/>
+          </w:tcPr>
+          <w:p>
+            <w:r/>
+            <w:r>
+              <w:rPr>
+                <w:rFonts w:ascii="Calibri" w:hAnsi="Calibri" w:eastAsia="Calibri"/>
+                <w:b w:val="0"/>
+                <w:sz w:val="20"/>
+              </w:rPr>
+              <w:t>Arauco Curauma</w:t>
+            </w:r>
+          </w:p>
+        </w:tc>
+        <w:tc>
+          <w:tcPr>
+            <w:tcW w:type="dxa" w:w="3437"/>
+          </w:tcPr>
+          <w:p>
+            <w:r/>
+            <w:r>
+              <w:rPr>
+                <w:rFonts w:ascii="Calibri" w:hAnsi="Calibri" w:eastAsia="Calibri"/>
+                <w:b w:val="0"/>
+                <w:sz w:val="20"/>
+              </w:rPr>
+              <w:t>Impulsión · Baño</w:t>
+            </w:r>
+          </w:p>
+        </w:tc>
+      </w:tr>
+      <w:tr>
+        <w:tc>
+          <w:tcPr>
+            <w:tcW w:type="dxa" w:w="3437"/>
+          </w:tcPr>
+          <w:p>
+            <w:r/>
+            <w:r>
+              <w:rPr>
+                <w:rFonts w:ascii="Calibri" w:hAnsi="Calibri" w:eastAsia="Calibri"/>
+                <w:b/>
+                <w:sz w:val="20"/>
+              </w:rPr>
+              <w:t>23-06-2026</w:t>
+            </w:r>
+          </w:p>
+        </w:tc>
+        <w:tc>
+          <w:tcPr>
+            <w:tcW w:type="dxa" w:w="3437"/>
+          </w:tcPr>
+          <w:p>
+            <w:r/>
+            <w:r>
+              <w:rPr>
+                <w:rFonts w:ascii="Calibri" w:hAnsi="Calibri" w:eastAsia="Calibri"/>
+                <w:b w:val="0"/>
+                <w:sz w:val="20"/>
+              </w:rPr>
+              <w:t>Arauco Estación</w:t>
+            </w:r>
+          </w:p>
+        </w:tc>
+        <w:tc>
+          <w:tcPr>
+            <w:tcW w:type="dxa" w:w="3437"/>
+          </w:tcPr>
+          <w:p>
+            <w:r/>
+            <w:r>
+              <w:rPr>
+                <w:rFonts w:ascii="Calibri" w:hAnsi="Calibri" w:eastAsia="Calibri"/>
+                <w:b w:val="0"/>
+                <w:sz w:val="20"/>
+              </w:rPr>
+              <w:t>Estanque sur — válvula de control · Estanque sur y norte</w:t>
+            </w:r>
+          </w:p>
+        </w:tc>
+      </w:tr>
+      <w:tr>
+        <w:tc>
+          <w:tcPr>
+            <w:tcW w:type="dxa" w:w="3437"/>
+          </w:tcPr>
+          <w:p>
+            <w:r/>
+            <w:r>
+              <w:rPr>
+                <w:rFonts w:ascii="Calibri" w:hAnsi="Calibri" w:eastAsia="Calibri"/>
+                <w:b/>
+                <w:sz w:val="20"/>
+              </w:rPr>
+              <w:t>13-08-2026</w:t>
+            </w:r>
+          </w:p>
+        </w:tc>
+        <w:tc>
+          <w:tcPr>
+            <w:tcW w:type="dxa" w:w="3437"/>
+          </w:tcPr>
+          <w:p>
+            <w:r/>
+            <w:r>
+              <w:rPr>
+                <w:rFonts w:ascii="Calibri" w:hAnsi="Calibri" w:eastAsia="Calibri"/>
+                <w:b w:val="0"/>
+                <w:sz w:val="20"/>
+              </w:rPr>
+              <w:t>Arauco Estación</w:t>
+            </w:r>
+          </w:p>
+        </w:tc>
+        <w:tc>
+          <w:tcPr>
+            <w:tcW w:type="dxa" w:w="3437"/>
+          </w:tcPr>
+          <w:p>
+            <w:r/>
+            <w:r>
+              <w:rPr>
+                <w:rFonts w:ascii="Calibri" w:hAnsi="Calibri" w:eastAsia="Calibri"/>
+                <w:b w:val="0"/>
+                <w:sz w:val="20"/>
+              </w:rPr>
+              <w:t>Estanque norte locales · Pizza Hut · Sala de bombas estanque sur</w:t>
+            </w:r>
+          </w:p>
+        </w:tc>
+      </w:tr>
+    </w:tbl>
+    <w:p>
+      <w:pPr>
         <w:spacing w:after="80" w:before="0"/>
       </w:pPr>
       <w:r>
@@ -793,7 +1052,7 @@
           <w:color w:val="1F4E79"/>
           <w:sz w:val="24"/>
         </w:rPr>
-        <w:t>05-01-2026  —  Arauco Buenaventura</w:t>
+        <w:t>05-01-2026  —  Arauco Buenaventura  ·  1 punto</w:t>
       </w:r>
     </w:p>
     <w:p>
@@ -820,7 +1079,7 @@
           <w:b/>
           <w:sz w:val="22"/>
         </w:rPr>
-        <w:t>MAX 232</w:t>
+        <w:t>1. MAX 232</w:t>
       </w:r>
     </w:p>
     <w:p>
@@ -861,7 +1120,7 @@
           <w:color w:val="1F4E79"/>
           <w:sz w:val="24"/>
         </w:rPr>
-        <w:t>05-01-2026  —  Arauco Estación</w:t>
+        <w:t>05-01-2026  —  Arauco Estación  ·  1 punto</w:t>
       </w:r>
     </w:p>
     <w:p>
@@ -888,7 +1147,7 @@
           <w:b/>
           <w:sz w:val="22"/>
         </w:rPr>
-        <w:t>Estanque sur</w:t>
+        <w:t>1. Estanque sur</w:t>
       </w:r>
     </w:p>
     <w:p>
@@ -915,7 +1174,7 @@
           <w:color w:val="1F4E79"/>
           <w:sz w:val="24"/>
         </w:rPr>
-        <w:t>22-01-2026  —  Arauco Estación</w:t>
+        <w:t>22-01-2026  —  Arauco Estación  ·  1 punto</w:t>
       </w:r>
     </w:p>
     <w:p>
@@ -942,7 +1201,7 @@
           <w:b/>
           <w:sz w:val="22"/>
         </w:rPr>
-        <w:t>KFC — baño de guardias</w:t>
+        <w:t>1. KFC — baño de guardias</w:t>
       </w:r>
     </w:p>
     <w:p>
@@ -983,7 +1242,7 @@
           <w:color w:val="1F4E79"/>
           <w:sz w:val="24"/>
         </w:rPr>
-        <w:t>23-01-2026  —  Arauco Estación</w:t>
+        <w:t>23-01-2026  —  Arauco Estación  ·  1 punto</w:t>
       </w:r>
     </w:p>
     <w:p>
@@ -1010,7 +1269,7 @@
           <w:b/>
           <w:sz w:val="22"/>
         </w:rPr>
-        <w:t>Pizza Hut</w:t>
+        <w:t>1. Pizza Hut</w:t>
       </w:r>
     </w:p>
     <w:p>
@@ -1051,7 +1310,7 @@
           <w:color w:val="1F4E79"/>
           <w:sz w:val="24"/>
         </w:rPr>
-        <w:t>05-02-2026  —  Arauco Estación</w:t>
+        <w:t>05-02-2026  —  Arauco Estación  ·  1 punto</w:t>
       </w:r>
     </w:p>
     <w:p>
@@ -1078,7 +1337,7 @@
           <w:b/>
           <w:sz w:val="22"/>
         </w:rPr>
-        <w:t>Baño de guardias</w:t>
+        <w:t>1. Baño de guardias</w:t>
       </w:r>
     </w:p>
     <w:p>
@@ -1119,7 +1378,7 @@
           <w:color w:val="1F4E79"/>
           <w:sz w:val="24"/>
         </w:rPr>
-        <w:t>04-03-2026  —  Parque Arauco Kennedy</w:t>
+        <w:t>04-03-2026  —  Parque Arauco Kennedy  ·  1 punto</w:t>
       </w:r>
     </w:p>
     <w:p>
@@ -1146,7 +1405,7 @@
           <w:b/>
           <w:sz w:val="22"/>
         </w:rPr>
-        <w:t>Baño varones N°6</w:t>
+        <w:t>1. Baño varones N°6</w:t>
       </w:r>
     </w:p>
     <w:p>
@@ -1187,7 +1446,7 @@
           <w:color w:val="1F4E79"/>
           <w:sz w:val="24"/>
         </w:rPr>
-        <w:t>12-03-2026  —  Arauco El Bosque</w:t>
+        <w:t>12-03-2026  —  Arauco El Bosque  ·  1 punto</w:t>
       </w:r>
     </w:p>
     <w:p>
@@ -1214,7 +1473,7 @@
           <w:b/>
           <w:sz w:val="22"/>
         </w:rPr>
-        <w:t>Tubería PPR</w:t>
+        <w:t>1. Tubería PPR</w:t>
       </w:r>
     </w:p>
     <w:p>
@@ -1241,7 +1500,7 @@
           <w:color w:val="1F4E79"/>
           <w:sz w:val="24"/>
         </w:rPr>
-        <w:t>19-03-2026  —  Arauco Curauma</w:t>
+        <w:t>19-03-2026  —  Arauco Curauma  ·  2 puntos, una visita</w:t>
       </w:r>
     </w:p>
     <w:p>
@@ -1268,7 +1527,7 @@
           <w:b/>
           <w:sz w:val="22"/>
         </w:rPr>
-        <w:t>Impulsión</w:t>
+        <w:t>1. Impulsión</w:t>
       </w:r>
     </w:p>
     <w:p>
@@ -1294,7 +1553,7 @@
           <w:b/>
           <w:sz w:val="22"/>
         </w:rPr>
-        <w:t>Baño</w:t>
+        <w:t>2. Baño</w:t>
       </w:r>
     </w:p>
     <w:p>
@@ -1321,7 +1580,7 @@
           <w:color w:val="1F4E79"/>
           <w:sz w:val="24"/>
         </w:rPr>
-        <w:t>31-03-2026  —  Arauco Buenaventura</w:t>
+        <w:t>31-03-2026  —  Arauco Buenaventura  ·  1 punto</w:t>
       </w:r>
     </w:p>
     <w:p>
@@ -1348,7 +1607,7 @@
           <w:b/>
           <w:sz w:val="22"/>
         </w:rPr>
-        <w:t>San Ignacio 500</w:t>
+        <w:t>1. San Ignacio 500</w:t>
       </w:r>
     </w:p>
     <w:p>
@@ -1389,7 +1648,7 @@
           <w:color w:val="1F4E79"/>
           <w:sz w:val="24"/>
         </w:rPr>
-        <w:t>02-04-2026  —  Arauco Maipú</w:t>
+        <w:t>02-04-2026  —  Arauco Maipú  ·  1 punto</w:t>
       </w:r>
     </w:p>
     <w:p>
@@ -1416,7 +1675,7 @@
           <w:b/>
           <w:sz w:val="22"/>
         </w:rPr>
-        <w:t>Sala de bombas Falabella</w:t>
+        <w:t>1. Sala de bombas Falabella</w:t>
       </w:r>
     </w:p>
     <w:p>
@@ -1457,7 +1716,7 @@
           <w:color w:val="1F4E79"/>
           <w:sz w:val="24"/>
         </w:rPr>
-        <w:t>11-05-2026  —  Arauco Curauma</w:t>
+        <w:t>11-05-2026  —  Arauco Curauma  ·  1 punto</w:t>
       </w:r>
     </w:p>
     <w:p>
@@ -1484,7 +1743,7 @@
           <w:b/>
           <w:sz w:val="22"/>
         </w:rPr>
-        <w:t>Sensor ultrasónico</w:t>
+        <w:t>1. Sensor ultrasónico</w:t>
       </w:r>
     </w:p>
     <w:p>
@@ -1511,7 +1770,7 @@
           <w:color w:val="1F4E79"/>
           <w:sz w:val="24"/>
         </w:rPr>
-        <w:t>15-05-2026  —  Arauco Estación</w:t>
+        <w:t>15-05-2026  —  Arauco Estación  ·  1 punto</w:t>
       </w:r>
     </w:p>
     <w:p>
@@ -1538,7 +1797,7 @@
           <w:b/>
           <w:sz w:val="22"/>
         </w:rPr>
-        <w:t>Estanque norte</w:t>
+        <w:t>1. Estanque norte</w:t>
       </w:r>
     </w:p>
     <w:p>
@@ -1565,7 +1824,7 @@
           <w:color w:val="1F4E79"/>
           <w:sz w:val="24"/>
         </w:rPr>
-        <w:t>19-05-2026  —  Arauco Curauma</w:t>
+        <w:t>19-05-2026  —  Arauco Curauma  ·  1 punto</w:t>
       </w:r>
     </w:p>
     <w:p>
@@ -1592,7 +1851,7 @@
           <w:b/>
           <w:sz w:val="22"/>
         </w:rPr>
-        <w:t>Equipo de monitoreo</w:t>
+        <w:t>1. Equipo de monitoreo</w:t>
       </w:r>
     </w:p>
     <w:p>
@@ -1619,7 +1878,7 @@
           <w:color w:val="1F4E79"/>
           <w:sz w:val="24"/>
         </w:rPr>
-        <w:t>20-05-2026  —  Parque Arauco Kennedy</w:t>
+        <w:t>20-05-2026  —  Parque Arauco Kennedy  ·  1 punto</w:t>
       </w:r>
     </w:p>
     <w:p>
@@ -1646,7 +1905,7 @@
           <w:b/>
           <w:sz w:val="22"/>
         </w:rPr>
-        <w:t>Punto de monitoreo</w:t>
+        <w:t>1. Punto de monitoreo</w:t>
       </w:r>
     </w:p>
     <w:p>
@@ -1687,7 +1946,7 @@
           <w:color w:val="1F4E79"/>
           <w:sz w:val="24"/>
         </w:rPr>
-        <w:t>23-06-2026  —  Arauco Estación</w:t>
+        <w:t>23-06-2026  —  Arauco Estación  ·  2 puntos, una visita</w:t>
       </w:r>
     </w:p>
     <w:p>
@@ -1714,7 +1973,7 @@
           <w:b/>
           <w:sz w:val="22"/>
         </w:rPr>
-        <w:t>Estanque sur — válvula de control</w:t>
+        <w:t>1. Estanque sur — válvula de control</w:t>
       </w:r>
     </w:p>
     <w:p>
@@ -1740,7 +1999,7 @@
           <w:b/>
           <w:sz w:val="22"/>
         </w:rPr>
-        <w:t>Estanque sur y norte</w:t>
+        <w:t>2. Estanque sur y norte</w:t>
       </w:r>
     </w:p>
     <w:p>
@@ -1781,7 +2040,7 @@
           <w:color w:val="1F4E79"/>
           <w:sz w:val="24"/>
         </w:rPr>
-        <w:t>15-07-2026  —  Arauco Buenaventura</w:t>
+        <w:t>15-07-2026  —  Arauco Buenaventura  ·  1 punto</w:t>
       </w:r>
     </w:p>
     <w:p>
@@ -1808,7 +2067,7 @@
           <w:b/>
           <w:sz w:val="22"/>
         </w:rPr>
-        <w:t>San Ignacio 500</w:t>
+        <w:t>1. San Ignacio 500</w:t>
       </w:r>
     </w:p>
     <w:p>
@@ -1863,7 +2122,7 @@
           <w:color w:val="1F4E79"/>
           <w:sz w:val="24"/>
         </w:rPr>
-        <w:t>13-08-2026  —  Arauco Estación</w:t>
+        <w:t>13-08-2026  —  Arauco Estación  ·  3 puntos, una visita</w:t>
       </w:r>
     </w:p>
     <w:p>
@@ -1890,7 +2149,7 @@
           <w:b/>
           <w:sz w:val="22"/>
         </w:rPr>
-        <w:t>Estanque norte locales</w:t>
+        <w:t>1. Estanque norte locales</w:t>
       </w:r>
     </w:p>
     <w:p>
@@ -1916,7 +2175,7 @@
           <w:b/>
           <w:sz w:val="22"/>
         </w:rPr>
-        <w:t>Pizza Hut</w:t>
+        <w:t>2. Pizza Hut</w:t>
       </w:r>
     </w:p>
     <w:p>
@@ -1942,7 +2201,7 @@
           <w:b/>
           <w:sz w:val="22"/>
         </w:rPr>
-        <w:t>Sala de bombas estanque sur</w:t>
+        <w:t>3. Sala de bombas estanque sur</w:t>
       </w:r>
     </w:p>
     <w:p>
@@ -1983,7 +2242,7 @@
           <w:color w:val="1F4E79"/>
           <w:sz w:val="24"/>
         </w:rPr>
-        <w:t>14-09-2026  —  Arauco Estación</w:t>
+        <w:t>14-09-2026  —  Arauco Estación  ·  1 punto</w:t>
       </w:r>
     </w:p>
     <w:p>
@@ -2010,7 +2269,7 @@
           <w:b/>
           <w:sz w:val="22"/>
         </w:rPr>
-        <w:t>Estanque norte locales</w:t>
+        <w:t>1. Estanque norte locales</w:t>
       </w:r>
     </w:p>
     <w:p>
@@ -2037,7 +2296,7 @@
           <w:color w:val="1F4E79"/>
           <w:sz w:val="24"/>
         </w:rPr>
-        <w:t>21-09-2026  —  Arauco Buenaventura</w:t>
+        <w:t>21-09-2026  —  Arauco Buenaventura  ·  1 punto</w:t>
       </w:r>
     </w:p>
     <w:p>
@@ -2064,7 +2323,7 @@
           <w:b/>
           <w:sz w:val="22"/>
         </w:rPr>
-        <w:t>San Ignacio 500</w:t>
+        <w:t>1. San Ignacio 500</w:t>
       </w:r>
     </w:p>
     <w:p>
@@ -2091,7 +2350,7 @@
           <w:color w:val="1F4E79"/>
           <w:sz w:val="24"/>
         </w:rPr>
-        <w:t>27-09-2026  —  Arauco Estación</w:t>
+        <w:t>27-09-2026  —  Arauco Estación  ·  1 punto</w:t>
       </w:r>
     </w:p>
     <w:p>
@@ -2118,7 +2377,7 @@
           <w:b/>
           <w:sz w:val="22"/>
         </w:rPr>
-        <w:t>Estanque norte locales</w:t>
+        <w:t>1. Estanque norte locales</w:t>
       </w:r>
     </w:p>
     <w:p>

</xml_diff>